<commit_message>
Finaliza documentação do projeto
</commit_message>
<xml_diff>
--- a/docs/SGHSS-Documentacao.docx
+++ b/docs/SGHSS-Documentacao.docx
@@ -31,7 +31,13 @@
     <w:sdt>
       <w:sdtPr>
         <w:rPr>
-          <w:lang w:val="pt-BR"/>
+          <w:rFonts w:asciiTheme="minorHAnsi" w:eastAsiaTheme="minorHAnsi" w:hAnsiTheme="minorHAnsi" w:cstheme="minorBidi"/>
+          <w:color w:val="auto"/>
+          <w:kern w:val="2"/>
+          <w:sz w:val="24"/>
+          <w:szCs w:val="24"/>
+          <w:lang w:val="pt-BR"/>
+          <w14:ligatures w14:val="standardContextual"/>
         </w:rPr>
         <w:id w:val="-1546210375"/>
         <w:docPartObj>
@@ -41,14 +47,8 @@
       </w:sdtPr>
       <w:sdtEndPr>
         <w:rPr>
-          <w:rFonts w:asciiTheme="minorHAnsi" w:eastAsiaTheme="minorHAnsi" w:hAnsiTheme="minorHAnsi" w:cstheme="minorBidi"/>
           <w:b/>
           <w:bCs/>
-          <w:color w:val="auto"/>
-          <w:kern w:val="2"/>
-          <w:sz w:val="24"/>
-          <w:szCs w:val="24"/>
-          <w14:ligatures w14:val="standardContextual"/>
         </w:rPr>
       </w:sdtEndPr>
       <w:sdtContent>
@@ -945,6 +945,524 @@
     </w:p>
     <w:p>
       <w:pPr>
+        <w:spacing w:after="0" w:line="360" w:lineRule="auto"/>
+        <w:ind w:firstLine="720"/>
+        <w:jc w:val="both"/>
+        <w:rPr>
+          <w:lang w:val="pt-BR"/>
+        </w:rPr>
+      </w:pPr>
+      <w:r>
+        <w:t xml:space="preserve">O </w:t>
+      </w:r>
+      <w:proofErr w:type="spellStart"/>
+      <w:r>
+        <w:t>sistema</w:t>
+      </w:r>
+      <w:proofErr w:type="spellEnd"/>
+      <w:r>
+        <w:t xml:space="preserve"> SGHSS </w:t>
+      </w:r>
+      <w:proofErr w:type="spellStart"/>
+      <w:r>
+        <w:t>tem</w:t>
+      </w:r>
+      <w:proofErr w:type="spellEnd"/>
+      <w:r>
+        <w:t xml:space="preserve"> </w:t>
+      </w:r>
+      <w:proofErr w:type="spellStart"/>
+      <w:r>
+        <w:t>como</w:t>
+      </w:r>
+      <w:proofErr w:type="spellEnd"/>
+      <w:r>
+        <w:t xml:space="preserve"> </w:t>
+      </w:r>
+      <w:proofErr w:type="spellStart"/>
+      <w:r>
+        <w:t>objetivo</w:t>
+      </w:r>
+      <w:proofErr w:type="spellEnd"/>
+      <w:r>
+        <w:t xml:space="preserve"> </w:t>
+      </w:r>
+      <w:proofErr w:type="spellStart"/>
+      <w:r>
+        <w:t>realizar</w:t>
+      </w:r>
+      <w:proofErr w:type="spellEnd"/>
+      <w:r>
+        <w:t xml:space="preserve"> o </w:t>
+      </w:r>
+      <w:proofErr w:type="spellStart"/>
+      <w:r>
+        <w:t>gerenciamento</w:t>
+      </w:r>
+      <w:proofErr w:type="spellEnd"/>
+      <w:r>
+        <w:t xml:space="preserve"> </w:t>
+      </w:r>
+      <w:proofErr w:type="spellStart"/>
+      <w:r>
+        <w:t>básico</w:t>
+      </w:r>
+      <w:proofErr w:type="spellEnd"/>
+      <w:r>
+        <w:t xml:space="preserve"> de </w:t>
+      </w:r>
+      <w:proofErr w:type="spellStart"/>
+      <w:r>
+        <w:t>informações</w:t>
+      </w:r>
+      <w:proofErr w:type="spellEnd"/>
+      <w:r>
+        <w:t xml:space="preserve"> </w:t>
+      </w:r>
+      <w:proofErr w:type="spellStart"/>
+      <w:r>
+        <w:t>hospitalares</w:t>
+      </w:r>
+      <w:proofErr w:type="spellEnd"/>
+      <w:r>
+        <w:t xml:space="preserve"> </w:t>
+      </w:r>
+      <w:proofErr w:type="spellStart"/>
+      <w:r>
+        <w:t>através</w:t>
+      </w:r>
+      <w:proofErr w:type="spellEnd"/>
+      <w:r>
+        <w:t xml:space="preserve"> de </w:t>
+      </w:r>
+      <w:proofErr w:type="spellStart"/>
+      <w:r>
+        <w:t>uma</w:t>
+      </w:r>
+      <w:proofErr w:type="spellEnd"/>
+      <w:r>
+        <w:t xml:space="preserve"> API REST </w:t>
+      </w:r>
+      <w:proofErr w:type="spellStart"/>
+      <w:r>
+        <w:t>desenvolvida</w:t>
+      </w:r>
+      <w:proofErr w:type="spellEnd"/>
+      <w:r>
+        <w:t xml:space="preserve"> com Java e Spring Boot.</w:t>
+      </w:r>
+      <w:r>
+        <w:br/>
+      </w:r>
+      <w:r>
+        <w:t xml:space="preserve"> </w:t>
+      </w:r>
+      <w:r>
+        <w:tab/>
+      </w:r>
+      <w:r>
+        <w:t xml:space="preserve">A </w:t>
+      </w:r>
+      <w:proofErr w:type="spellStart"/>
+      <w:r>
+        <w:t>aplicação</w:t>
+      </w:r>
+      <w:proofErr w:type="spellEnd"/>
+      <w:r>
+        <w:t xml:space="preserve"> </w:t>
+      </w:r>
+      <w:proofErr w:type="spellStart"/>
+      <w:r>
+        <w:t>foi</w:t>
+      </w:r>
+      <w:proofErr w:type="spellEnd"/>
+      <w:r>
+        <w:t xml:space="preserve"> </w:t>
+      </w:r>
+      <w:proofErr w:type="spellStart"/>
+      <w:r>
+        <w:t>projetada</w:t>
+      </w:r>
+      <w:proofErr w:type="spellEnd"/>
+      <w:r>
+        <w:t xml:space="preserve"> para </w:t>
+      </w:r>
+      <w:proofErr w:type="spellStart"/>
+      <w:r>
+        <w:t>permitir</w:t>
+      </w:r>
+      <w:proofErr w:type="spellEnd"/>
+      <w:r>
+        <w:t xml:space="preserve"> o </w:t>
+      </w:r>
+      <w:proofErr w:type="spellStart"/>
+      <w:r>
+        <w:t>cadastro</w:t>
+      </w:r>
+      <w:proofErr w:type="spellEnd"/>
+      <w:r>
+        <w:t xml:space="preserve"> e </w:t>
+      </w:r>
+      <w:proofErr w:type="spellStart"/>
+      <w:r>
+        <w:t>gerenciamento</w:t>
+      </w:r>
+      <w:proofErr w:type="spellEnd"/>
+      <w:r>
+        <w:t xml:space="preserve"> de </w:t>
+      </w:r>
+      <w:proofErr w:type="spellStart"/>
+      <w:r>
+        <w:t>usuários</w:t>
+      </w:r>
+      <w:proofErr w:type="spellEnd"/>
+      <w:r>
+        <w:t xml:space="preserve">, </w:t>
+      </w:r>
+      <w:proofErr w:type="spellStart"/>
+      <w:r>
+        <w:t>pacientes</w:t>
+      </w:r>
+      <w:proofErr w:type="spellEnd"/>
+      <w:r>
+        <w:t xml:space="preserve">, </w:t>
+      </w:r>
+      <w:proofErr w:type="spellStart"/>
+      <w:r>
+        <w:t>médicos</w:t>
+      </w:r>
+      <w:proofErr w:type="spellEnd"/>
+      <w:r>
+        <w:t xml:space="preserve"> e </w:t>
+      </w:r>
+      <w:proofErr w:type="spellStart"/>
+      <w:r>
+        <w:t>consultas</w:t>
+      </w:r>
+      <w:proofErr w:type="spellEnd"/>
+      <w:r>
+        <w:t xml:space="preserve"> </w:t>
+      </w:r>
+      <w:proofErr w:type="spellStart"/>
+      <w:r>
+        <w:t>médicas</w:t>
+      </w:r>
+      <w:proofErr w:type="spellEnd"/>
+      <w:r>
+        <w:t xml:space="preserve">, </w:t>
+      </w:r>
+      <w:proofErr w:type="spellStart"/>
+      <w:r>
+        <w:t>utilizando</w:t>
+      </w:r>
+      <w:proofErr w:type="spellEnd"/>
+      <w:r>
+        <w:t xml:space="preserve"> </w:t>
+      </w:r>
+      <w:proofErr w:type="spellStart"/>
+      <w:r>
+        <w:t>uma</w:t>
+      </w:r>
+      <w:proofErr w:type="spellEnd"/>
+      <w:r>
+        <w:t xml:space="preserve"> </w:t>
+      </w:r>
+      <w:proofErr w:type="spellStart"/>
+      <w:r>
+        <w:t>arquitetura</w:t>
+      </w:r>
+      <w:proofErr w:type="spellEnd"/>
+      <w:r>
+        <w:t xml:space="preserve"> </w:t>
+      </w:r>
+      <w:proofErr w:type="spellStart"/>
+      <w:r>
+        <w:t>organizada</w:t>
+      </w:r>
+      <w:proofErr w:type="spellEnd"/>
+      <w:r>
+        <w:t xml:space="preserve"> </w:t>
+      </w:r>
+      <w:proofErr w:type="spellStart"/>
+      <w:r>
+        <w:t>em</w:t>
+      </w:r>
+      <w:proofErr w:type="spellEnd"/>
+      <w:r>
+        <w:t xml:space="preserve"> </w:t>
+      </w:r>
+      <w:proofErr w:type="spellStart"/>
+      <w:r>
+        <w:t>camadas</w:t>
+      </w:r>
+      <w:proofErr w:type="spellEnd"/>
+      <w:r>
+        <w:t xml:space="preserve"> e </w:t>
+      </w:r>
+      <w:proofErr w:type="spellStart"/>
+      <w:r>
+        <w:t>integração</w:t>
+      </w:r>
+      <w:proofErr w:type="spellEnd"/>
+      <w:r>
+        <w:t xml:space="preserve"> com banco de dados </w:t>
+      </w:r>
+      <w:proofErr w:type="spellStart"/>
+      <w:r>
+        <w:t>relacional</w:t>
+      </w:r>
+      <w:proofErr w:type="spellEnd"/>
+      <w:r>
+        <w:t>.</w:t>
+      </w:r>
+      <w:r>
+        <w:br/>
+      </w:r>
+      <w:r>
+        <w:t xml:space="preserve"> </w:t>
+      </w:r>
+      <w:r>
+        <w:tab/>
+      </w:r>
+      <w:proofErr w:type="spellStart"/>
+      <w:r>
+        <w:t>Além</w:t>
+      </w:r>
+      <w:proofErr w:type="spellEnd"/>
+      <w:r>
+        <w:t xml:space="preserve"> </w:t>
+      </w:r>
+      <w:proofErr w:type="spellStart"/>
+      <w:r>
+        <w:t>disso</w:t>
+      </w:r>
+      <w:proofErr w:type="spellEnd"/>
+      <w:r>
+        <w:t xml:space="preserve">, o </w:t>
+      </w:r>
+      <w:proofErr w:type="spellStart"/>
+      <w:r>
+        <w:t>sistema</w:t>
+      </w:r>
+      <w:proofErr w:type="spellEnd"/>
+      <w:r>
+        <w:t xml:space="preserve"> </w:t>
+      </w:r>
+      <w:proofErr w:type="spellStart"/>
+      <w:r>
+        <w:t>implementa</w:t>
+      </w:r>
+      <w:proofErr w:type="spellEnd"/>
+      <w:r>
+        <w:t xml:space="preserve"> </w:t>
+      </w:r>
+      <w:proofErr w:type="spellStart"/>
+      <w:r>
+        <w:t>autenticação</w:t>
+      </w:r>
+      <w:proofErr w:type="spellEnd"/>
+      <w:r>
+        <w:t xml:space="preserve"> </w:t>
+      </w:r>
+      <w:proofErr w:type="spellStart"/>
+      <w:r>
+        <w:t>utilizando</w:t>
+      </w:r>
+      <w:proofErr w:type="spellEnd"/>
+      <w:r>
+        <w:t xml:space="preserve"> JWT (JSON Web Token), </w:t>
+      </w:r>
+      <w:proofErr w:type="spellStart"/>
+      <w:r>
+        <w:t>garantindo</w:t>
+      </w:r>
+      <w:proofErr w:type="spellEnd"/>
+      <w:r>
+        <w:t xml:space="preserve"> </w:t>
+      </w:r>
+      <w:proofErr w:type="spellStart"/>
+      <w:r>
+        <w:t>maior</w:t>
+      </w:r>
+      <w:proofErr w:type="spellEnd"/>
+      <w:r>
+        <w:t xml:space="preserve"> </w:t>
+      </w:r>
+      <w:proofErr w:type="spellStart"/>
+      <w:r>
+        <w:t>segurança</w:t>
+      </w:r>
+      <w:proofErr w:type="spellEnd"/>
+      <w:r>
+        <w:t xml:space="preserve"> no </w:t>
+      </w:r>
+      <w:proofErr w:type="spellStart"/>
+      <w:r>
+        <w:t>acesso</w:t>
+      </w:r>
+      <w:proofErr w:type="spellEnd"/>
+      <w:r>
+        <w:t xml:space="preserve"> </w:t>
+      </w:r>
+      <w:proofErr w:type="spellStart"/>
+      <w:r>
+        <w:t>aos</w:t>
+      </w:r>
+      <w:proofErr w:type="spellEnd"/>
+      <w:r>
+        <w:t xml:space="preserve"> </w:t>
+      </w:r>
+      <w:proofErr w:type="spellStart"/>
+      <w:r>
+        <w:t>recursos</w:t>
+      </w:r>
+      <w:proofErr w:type="spellEnd"/>
+      <w:r>
+        <w:t xml:space="preserve"> da </w:t>
+      </w:r>
+      <w:proofErr w:type="spellStart"/>
+      <w:r>
+        <w:t>aplicação</w:t>
+      </w:r>
+      <w:proofErr w:type="spellEnd"/>
+      <w:r>
+        <w:t>.</w:t>
+      </w:r>
+      <w:r>
+        <w:br/>
+      </w:r>
+      <w:r>
+        <w:t xml:space="preserve"> </w:t>
+      </w:r>
+      <w:r>
+        <w:tab/>
+      </w:r>
+      <w:r>
+        <w:t xml:space="preserve">Outro </w:t>
+      </w:r>
+      <w:proofErr w:type="spellStart"/>
+      <w:r>
+        <w:t>objetivo</w:t>
+      </w:r>
+      <w:proofErr w:type="spellEnd"/>
+      <w:r>
+        <w:t xml:space="preserve"> do </w:t>
+      </w:r>
+      <w:proofErr w:type="spellStart"/>
+      <w:r>
+        <w:t>projeto</w:t>
+      </w:r>
+      <w:proofErr w:type="spellEnd"/>
+      <w:r>
+        <w:t xml:space="preserve"> </w:t>
+      </w:r>
+      <w:proofErr w:type="spellStart"/>
+      <w:r>
+        <w:t>foi</w:t>
+      </w:r>
+      <w:proofErr w:type="spellEnd"/>
+      <w:r>
+        <w:t xml:space="preserve"> </w:t>
+      </w:r>
+      <w:proofErr w:type="spellStart"/>
+      <w:r>
+        <w:t>aplicar</w:t>
+      </w:r>
+      <w:proofErr w:type="spellEnd"/>
+      <w:r>
+        <w:t xml:space="preserve"> </w:t>
+      </w:r>
+      <w:proofErr w:type="spellStart"/>
+      <w:r>
+        <w:t>conceitos</w:t>
+      </w:r>
+      <w:proofErr w:type="spellEnd"/>
+      <w:r>
+        <w:t xml:space="preserve"> </w:t>
+      </w:r>
+      <w:proofErr w:type="spellStart"/>
+      <w:r>
+        <w:t>modernos</w:t>
+      </w:r>
+      <w:proofErr w:type="spellEnd"/>
+      <w:r>
+        <w:t xml:space="preserve"> </w:t>
+      </w:r>
+      <w:proofErr w:type="spellStart"/>
+      <w:r>
+        <w:t>utilizados</w:t>
+      </w:r>
+      <w:proofErr w:type="spellEnd"/>
+      <w:r>
+        <w:t xml:space="preserve"> no </w:t>
+      </w:r>
+      <w:proofErr w:type="spellStart"/>
+      <w:r>
+        <w:t>desenvolvimento</w:t>
+      </w:r>
+      <w:proofErr w:type="spellEnd"/>
+      <w:r>
+        <w:t xml:space="preserve"> Back-end </w:t>
+      </w:r>
+      <w:proofErr w:type="spellStart"/>
+      <w:r>
+        <w:t>profissional</w:t>
+      </w:r>
+      <w:proofErr w:type="spellEnd"/>
+      <w:r>
+        <w:t xml:space="preserve">, </w:t>
+      </w:r>
+      <w:proofErr w:type="spellStart"/>
+      <w:r>
+        <w:t>incluindo</w:t>
+      </w:r>
+      <w:proofErr w:type="spellEnd"/>
+      <w:r>
+        <w:t xml:space="preserve"> </w:t>
+      </w:r>
+      <w:proofErr w:type="spellStart"/>
+      <w:r>
+        <w:t>documentação</w:t>
+      </w:r>
+      <w:proofErr w:type="spellEnd"/>
+      <w:r>
+        <w:t xml:space="preserve"> com Swagger/</w:t>
+      </w:r>
+      <w:proofErr w:type="spellStart"/>
+      <w:r>
+        <w:t>OpenAPI</w:t>
+      </w:r>
+      <w:proofErr w:type="spellEnd"/>
+      <w:r>
+        <w:t xml:space="preserve">, </w:t>
+      </w:r>
+      <w:proofErr w:type="spellStart"/>
+      <w:r>
+        <w:t>persistência</w:t>
+      </w:r>
+      <w:proofErr w:type="spellEnd"/>
+      <w:r>
+        <w:t xml:space="preserve"> de dados com JPA/Hibernate e </w:t>
+      </w:r>
+      <w:proofErr w:type="spellStart"/>
+      <w:r>
+        <w:t>execução</w:t>
+      </w:r>
+      <w:proofErr w:type="spellEnd"/>
+      <w:r>
+        <w:t xml:space="preserve"> </w:t>
+      </w:r>
+      <w:proofErr w:type="spellStart"/>
+      <w:r>
+        <w:t>utilizando</w:t>
+      </w:r>
+      <w:proofErr w:type="spellEnd"/>
+      <w:r>
+        <w:t xml:space="preserve"> Docker.</w:t>
+      </w:r>
+    </w:p>
+    <w:p>
+      <w:pPr>
         <w:pStyle w:val="Ttulo1"/>
         <w:spacing w:line="360" w:lineRule="auto"/>
         <w:jc w:val="both"/>
@@ -971,6 +1489,340 @@
     </w:p>
     <w:p>
       <w:pPr>
+        <w:rPr>
+          <w:lang w:val="pt-BR"/>
+        </w:rPr>
+      </w:pPr>
+      <w:r>
+        <w:rPr>
+          <w:lang w:val="pt-BR"/>
+        </w:rPr>
+        <w:t>Durante o desenvolvimento do sistema foram utilizadas tecnologias modernas voltadas ao desenvolvimento Back-</w:t>
+      </w:r>
+      <w:proofErr w:type="spellStart"/>
+      <w:r>
+        <w:rPr>
+          <w:lang w:val="pt-BR"/>
+        </w:rPr>
+        <w:t>end</w:t>
+      </w:r>
+      <w:proofErr w:type="spellEnd"/>
+      <w:r>
+        <w:rPr>
+          <w:lang w:val="pt-BR"/>
+        </w:rPr>
+        <w:t xml:space="preserve"> com Java.</w:t>
+      </w:r>
+    </w:p>
+    <w:p>
+      <w:pPr>
+        <w:rPr>
+          <w:lang w:val="pt-BR"/>
+        </w:rPr>
+      </w:pPr>
+      <w:r>
+        <w:rPr>
+          <w:lang w:val="pt-BR"/>
+        </w:rPr>
+        <w:t>Java 21</w:t>
+      </w:r>
+    </w:p>
+    <w:p>
+      <w:pPr>
+        <w:rPr>
+          <w:lang w:val="pt-BR"/>
+        </w:rPr>
+      </w:pPr>
+      <w:r>
+        <w:rPr>
+          <w:lang w:val="pt-BR"/>
+        </w:rPr>
+        <w:t>Linguagem principal utilizada no desenvolvimento da aplicação.</w:t>
+      </w:r>
+    </w:p>
+    <w:p>
+      <w:pPr>
+        <w:rPr>
+          <w:lang w:val="pt-BR"/>
+        </w:rPr>
+      </w:pPr>
+      <w:r>
+        <w:rPr>
+          <w:lang w:val="pt-BR"/>
+        </w:rPr>
+        <w:t>Spring Boot</w:t>
+      </w:r>
+    </w:p>
+    <w:p>
+      <w:pPr>
+        <w:rPr>
+          <w:lang w:val="pt-BR"/>
+        </w:rPr>
+      </w:pPr>
+      <w:r>
+        <w:rPr>
+          <w:lang w:val="pt-BR"/>
+        </w:rPr>
+        <w:t>Framework utilizado para criação da API REST e gerenciamento da aplicação.</w:t>
+      </w:r>
+    </w:p>
+    <w:p>
+      <w:pPr>
+        <w:rPr>
+          <w:lang w:val="pt-BR"/>
+        </w:rPr>
+      </w:pPr>
+      <w:r>
+        <w:rPr>
+          <w:lang w:val="pt-BR"/>
+        </w:rPr>
+        <w:t>Spring Web</w:t>
+      </w:r>
+    </w:p>
+    <w:p>
+      <w:pPr>
+        <w:rPr>
+          <w:lang w:val="pt-BR"/>
+        </w:rPr>
+      </w:pPr>
+      <w:r>
+        <w:rPr>
+          <w:lang w:val="pt-BR"/>
+        </w:rPr>
+        <w:t xml:space="preserve">Responsável pela criação dos </w:t>
+      </w:r>
+      <w:proofErr w:type="spellStart"/>
+      <w:r>
+        <w:rPr>
+          <w:lang w:val="pt-BR"/>
+        </w:rPr>
+        <w:t>endpoints</w:t>
+      </w:r>
+      <w:proofErr w:type="spellEnd"/>
+      <w:r>
+        <w:rPr>
+          <w:lang w:val="pt-BR"/>
+        </w:rPr>
+        <w:t xml:space="preserve"> HTTP da API.</w:t>
+      </w:r>
+    </w:p>
+    <w:p>
+      <w:pPr>
+        <w:rPr>
+          <w:lang w:val="pt-BR"/>
+        </w:rPr>
+      </w:pPr>
+      <w:r>
+        <w:rPr>
+          <w:lang w:val="pt-BR"/>
+        </w:rPr>
+        <w:t>Spring Data JPA</w:t>
+      </w:r>
+    </w:p>
+    <w:p>
+      <w:pPr>
+        <w:rPr>
+          <w:lang w:val="pt-BR"/>
+        </w:rPr>
+      </w:pPr>
+      <w:r>
+        <w:rPr>
+          <w:lang w:val="pt-BR"/>
+        </w:rPr>
+        <w:t>Utilizado para persistência de dados e integração com o banco de dados.</w:t>
+      </w:r>
+    </w:p>
+    <w:p>
+      <w:pPr>
+        <w:rPr>
+          <w:lang w:val="pt-BR"/>
+        </w:rPr>
+      </w:pPr>
+      <w:r>
+        <w:rPr>
+          <w:lang w:val="pt-BR"/>
+        </w:rPr>
+        <w:t>Spring Security</w:t>
+      </w:r>
+    </w:p>
+    <w:p>
+      <w:pPr>
+        <w:rPr>
+          <w:lang w:val="pt-BR"/>
+        </w:rPr>
+      </w:pPr>
+      <w:r>
+        <w:rPr>
+          <w:lang w:val="pt-BR"/>
+        </w:rPr>
+        <w:t>Responsável pela configuração de segurança e autenticação da aplicação.</w:t>
+      </w:r>
+    </w:p>
+    <w:p>
+      <w:pPr>
+        <w:rPr>
+          <w:lang w:val="pt-BR"/>
+        </w:rPr>
+      </w:pPr>
+      <w:r>
+        <w:rPr>
+          <w:lang w:val="pt-BR"/>
+        </w:rPr>
+        <w:t>JWT (JSON Web Token)</w:t>
+      </w:r>
+    </w:p>
+    <w:p>
+      <w:pPr>
+        <w:rPr>
+          <w:lang w:val="pt-BR"/>
+        </w:rPr>
+      </w:pPr>
+      <w:r>
+        <w:rPr>
+          <w:lang w:val="pt-BR"/>
+        </w:rPr>
+        <w:lastRenderedPageBreak/>
+        <w:t>Tecnologia utilizada para autenticação e geração de tokens de acesso.</w:t>
+      </w:r>
+    </w:p>
+    <w:p>
+      <w:pPr>
+        <w:rPr>
+          <w:lang w:val="pt-BR"/>
+        </w:rPr>
+      </w:pPr>
+      <w:r>
+        <w:rPr>
+          <w:lang w:val="pt-BR"/>
+        </w:rPr>
+        <w:t xml:space="preserve">H2 </w:t>
+      </w:r>
+      <w:proofErr w:type="spellStart"/>
+      <w:r>
+        <w:rPr>
+          <w:lang w:val="pt-BR"/>
+        </w:rPr>
+        <w:t>Database</w:t>
+      </w:r>
+      <w:proofErr w:type="spellEnd"/>
+    </w:p>
+    <w:p>
+      <w:pPr>
+        <w:rPr>
+          <w:lang w:val="pt-BR"/>
+        </w:rPr>
+      </w:pPr>
+      <w:r>
+        <w:rPr>
+          <w:lang w:val="pt-BR"/>
+        </w:rPr>
+        <w:t>Banco de dados utilizado durante o desenvolvimento da aplicação.</w:t>
+      </w:r>
+    </w:p>
+    <w:p>
+      <w:pPr>
+        <w:rPr>
+          <w:lang w:val="pt-BR"/>
+        </w:rPr>
+      </w:pPr>
+      <w:r>
+        <w:rPr>
+          <w:lang w:val="pt-BR"/>
+        </w:rPr>
+        <w:t>Swagger/</w:t>
+      </w:r>
+      <w:proofErr w:type="spellStart"/>
+      <w:r>
+        <w:rPr>
+          <w:lang w:val="pt-BR"/>
+        </w:rPr>
+        <w:t>OpenAPI</w:t>
+      </w:r>
+      <w:proofErr w:type="spellEnd"/>
+    </w:p>
+    <w:p>
+      <w:pPr>
+        <w:rPr>
+          <w:lang w:val="pt-BR"/>
+        </w:rPr>
+      </w:pPr>
+      <w:r>
+        <w:rPr>
+          <w:lang w:val="pt-BR"/>
+        </w:rPr>
+        <w:t>Ferramenta utilizada para documentação automática da API REST.</w:t>
+      </w:r>
+    </w:p>
+    <w:p>
+      <w:pPr>
+        <w:rPr>
+          <w:lang w:val="pt-BR"/>
+        </w:rPr>
+      </w:pPr>
+      <w:r>
+        <w:rPr>
+          <w:lang w:val="pt-BR"/>
+        </w:rPr>
+        <w:t>Docker</w:t>
+      </w:r>
+    </w:p>
+    <w:p>
+      <w:pPr>
+        <w:rPr>
+          <w:lang w:val="pt-BR"/>
+        </w:rPr>
+      </w:pPr>
+      <w:r>
+        <w:rPr>
+          <w:lang w:val="pt-BR"/>
+        </w:rPr>
+        <w:t xml:space="preserve">Utilizado para </w:t>
+      </w:r>
+      <w:proofErr w:type="spellStart"/>
+      <w:r>
+        <w:rPr>
+          <w:lang w:val="pt-BR"/>
+        </w:rPr>
+        <w:t>containerização</w:t>
+      </w:r>
+      <w:proofErr w:type="spellEnd"/>
+      <w:r>
+        <w:rPr>
+          <w:lang w:val="pt-BR"/>
+        </w:rPr>
+        <w:t xml:space="preserve"> e execução da aplicação sem necessidade de configuração manual do ambiente Java.</w:t>
+      </w:r>
+    </w:p>
+    <w:p>
+      <w:pPr>
+        <w:rPr>
+          <w:lang w:val="pt-BR"/>
+        </w:rPr>
+      </w:pPr>
+      <w:proofErr w:type="spellStart"/>
+      <w:r>
+        <w:rPr>
+          <w:lang w:val="pt-BR"/>
+        </w:rPr>
+        <w:t>Maven</w:t>
+      </w:r>
+      <w:proofErr w:type="spellEnd"/>
+    </w:p>
+    <w:p>
+      <w:pPr>
+        <w:rPr>
+          <w:lang w:val="pt-BR"/>
+        </w:rPr>
+      </w:pPr>
+      <w:r>
+        <w:rPr>
+          <w:lang w:val="pt-BR"/>
+        </w:rPr>
+        <w:t>Ferramenta utilizada para gerenciamento de dependências e build do projeto.</w:t>
+      </w:r>
+    </w:p>
+    <w:p>
+      <w:pPr>
         <w:pStyle w:val="Ttulo1"/>
         <w:spacing w:line="360" w:lineRule="auto"/>
         <w:jc w:val="both"/>
@@ -997,6 +1849,291 @@
     </w:p>
     <w:p>
       <w:pPr>
+        <w:rPr>
+          <w:lang w:val="pt-BR"/>
+        </w:rPr>
+      </w:pPr>
+      <w:r>
+        <w:rPr>
+          <w:lang w:val="pt-BR"/>
+        </w:rPr>
+        <w:t>O sistema foi desenvolvido utilizando arquitetura em camadas, separando responsabilidades para facilitar manutenção, organização e escalabilidade da aplicação.</w:t>
+      </w:r>
+    </w:p>
+    <w:p>
+      <w:pPr>
+        <w:rPr>
+          <w:lang w:val="pt-BR"/>
+        </w:rPr>
+      </w:pPr>
+      <w:r>
+        <w:rPr>
+          <w:lang w:val="pt-BR"/>
+        </w:rPr>
+        <w:t>A estrutura do projeto foi organizada em pacotes específicos para configuração, controle das rotas da API, transferência de dados, entidades do banco de dados, repositórios e regras de negócio.</w:t>
+      </w:r>
+    </w:p>
+    <w:p>
+      <w:pPr>
+        <w:rPr>
+          <w:lang w:val="pt-BR"/>
+        </w:rPr>
+      </w:pPr>
+      <w:r>
+        <w:rPr>
+          <w:lang w:val="pt-BR"/>
+        </w:rPr>
+        <w:t>As principais camadas utilizadas no projeto foram:</w:t>
+      </w:r>
+    </w:p>
+    <w:p>
+      <w:pPr>
+        <w:rPr>
+          <w:lang w:val="pt-BR"/>
+        </w:rPr>
+      </w:pPr>
+      <w:proofErr w:type="spellStart"/>
+      <w:r>
+        <w:rPr>
+          <w:lang w:val="pt-BR"/>
+        </w:rPr>
+        <w:t>Config</w:t>
+      </w:r>
+      <w:proofErr w:type="spellEnd"/>
+    </w:p>
+    <w:p>
+      <w:pPr>
+        <w:rPr>
+          <w:lang w:val="pt-BR"/>
+        </w:rPr>
+      </w:pPr>
+      <w:r>
+        <w:rPr>
+          <w:lang w:val="pt-BR"/>
+        </w:rPr>
+        <w:t>Responsável pelas configurações de segurança e autenticação da aplicação, incluindo integração com JWT e Spring Security.</w:t>
+      </w:r>
+    </w:p>
+    <w:p>
+      <w:pPr>
+        <w:rPr>
+          <w:lang w:val="pt-BR"/>
+        </w:rPr>
+      </w:pPr>
+      <w:proofErr w:type="spellStart"/>
+      <w:r>
+        <w:rPr>
+          <w:lang w:val="pt-BR"/>
+        </w:rPr>
+        <w:t>Controller</w:t>
+      </w:r>
+      <w:proofErr w:type="spellEnd"/>
+    </w:p>
+    <w:p>
+      <w:pPr>
+        <w:rPr>
+          <w:lang w:val="pt-BR"/>
+        </w:rPr>
+      </w:pPr>
+      <w:r>
+        <w:rPr>
+          <w:lang w:val="pt-BR"/>
+        </w:rPr>
+        <w:t>Camada responsável pelo recebimento das requisições HTTP da API REST, controle das rotas e retorno das respostas ao cliente.</w:t>
+      </w:r>
+    </w:p>
+    <w:p>
+      <w:pPr>
+        <w:rPr>
+          <w:lang w:val="pt-BR"/>
+        </w:rPr>
+      </w:pPr>
+      <w:r>
+        <w:rPr>
+          <w:lang w:val="pt-BR"/>
+        </w:rPr>
+        <w:t xml:space="preserve">DTO (Data </w:t>
+      </w:r>
+      <w:proofErr w:type="spellStart"/>
+      <w:r>
+        <w:rPr>
+          <w:lang w:val="pt-BR"/>
+        </w:rPr>
+        <w:t>Transfer</w:t>
+      </w:r>
+      <w:proofErr w:type="spellEnd"/>
+      <w:r>
+        <w:rPr>
+          <w:lang w:val="pt-BR"/>
+        </w:rPr>
+        <w:t xml:space="preserve"> </w:t>
+      </w:r>
+      <w:proofErr w:type="spellStart"/>
+      <w:r>
+        <w:rPr>
+          <w:lang w:val="pt-BR"/>
+        </w:rPr>
+        <w:t>Object</w:t>
+      </w:r>
+      <w:proofErr w:type="spellEnd"/>
+      <w:r>
+        <w:rPr>
+          <w:lang w:val="pt-BR"/>
+        </w:rPr>
+        <w:t>)</w:t>
+      </w:r>
+    </w:p>
+    <w:p>
+      <w:pPr>
+        <w:rPr>
+          <w:lang w:val="pt-BR"/>
+        </w:rPr>
+      </w:pPr>
+      <w:r>
+        <w:rPr>
+          <w:lang w:val="pt-BR"/>
+        </w:rPr>
+        <w:t>Responsável pela transferência de dados entre cliente e servidor, evitando exposição direta das entidades do banco de dados.</w:t>
+      </w:r>
+    </w:p>
+    <w:p>
+      <w:pPr>
+        <w:rPr>
+          <w:lang w:val="pt-BR"/>
+        </w:rPr>
+      </w:pPr>
+      <w:r>
+        <w:rPr>
+          <w:lang w:val="pt-BR"/>
+        </w:rPr>
+        <w:t>Entity</w:t>
+      </w:r>
+    </w:p>
+    <w:p>
+      <w:pPr>
+        <w:rPr>
+          <w:lang w:val="pt-BR"/>
+        </w:rPr>
+      </w:pPr>
+      <w:r>
+        <w:rPr>
+          <w:lang w:val="pt-BR"/>
+        </w:rPr>
+        <w:t>Representa as tabelas do banco de dados através das entidades JPA/</w:t>
+      </w:r>
+      <w:proofErr w:type="spellStart"/>
+      <w:r>
+        <w:rPr>
+          <w:lang w:val="pt-BR"/>
+        </w:rPr>
+        <w:t>Hibernate</w:t>
+      </w:r>
+      <w:proofErr w:type="spellEnd"/>
+      <w:r>
+        <w:rPr>
+          <w:lang w:val="pt-BR"/>
+        </w:rPr>
+        <w:t>.</w:t>
+      </w:r>
+    </w:p>
+    <w:p>
+      <w:pPr>
+        <w:rPr>
+          <w:lang w:val="pt-BR"/>
+        </w:rPr>
+      </w:pPr>
+      <w:proofErr w:type="spellStart"/>
+      <w:r>
+        <w:rPr>
+          <w:lang w:val="pt-BR"/>
+        </w:rPr>
+        <w:lastRenderedPageBreak/>
+        <w:t>Repository</w:t>
+      </w:r>
+      <w:proofErr w:type="spellEnd"/>
+    </w:p>
+    <w:p>
+      <w:pPr>
+        <w:rPr>
+          <w:lang w:val="pt-BR"/>
+        </w:rPr>
+      </w:pPr>
+      <w:r>
+        <w:rPr>
+          <w:lang w:val="pt-BR"/>
+        </w:rPr>
+        <w:t>Camada responsável pelo acesso e manipulação dos dados no banco utilizando Spring Data JPA.</w:t>
+      </w:r>
+    </w:p>
+    <w:p>
+      <w:pPr>
+        <w:rPr>
+          <w:lang w:val="pt-BR"/>
+        </w:rPr>
+      </w:pPr>
+      <w:r>
+        <w:rPr>
+          <w:lang w:val="pt-BR"/>
+        </w:rPr>
+        <w:t>Service</w:t>
+      </w:r>
+    </w:p>
+    <w:p>
+      <w:pPr>
+        <w:rPr>
+          <w:lang w:val="pt-BR"/>
+        </w:rPr>
+      </w:pPr>
+      <w:r>
+        <w:rPr>
+          <w:lang w:val="pt-BR"/>
+        </w:rPr>
+        <w:t xml:space="preserve">Responsável pelas regras de negócio da aplicação, processamento de dados e integração entre </w:t>
+      </w:r>
+      <w:proofErr w:type="spellStart"/>
+      <w:r>
+        <w:rPr>
+          <w:lang w:val="pt-BR"/>
+        </w:rPr>
+        <w:t>controllers</w:t>
+      </w:r>
+      <w:proofErr w:type="spellEnd"/>
+      <w:r>
+        <w:rPr>
+          <w:lang w:val="pt-BR"/>
+        </w:rPr>
+        <w:t xml:space="preserve"> e </w:t>
+      </w:r>
+      <w:proofErr w:type="spellStart"/>
+      <w:r>
+        <w:rPr>
+          <w:lang w:val="pt-BR"/>
+        </w:rPr>
+        <w:t>repositories</w:t>
+      </w:r>
+      <w:proofErr w:type="spellEnd"/>
+      <w:r>
+        <w:rPr>
+          <w:lang w:val="pt-BR"/>
+        </w:rPr>
+        <w:t>.</w:t>
+      </w:r>
+    </w:p>
+    <w:p>
+      <w:pPr>
+        <w:rPr>
+          <w:lang w:val="pt-BR"/>
+        </w:rPr>
+      </w:pPr>
+      <w:r>
+        <w:rPr>
+          <w:lang w:val="pt-BR"/>
+        </w:rPr>
+        <w:t>A organização em camadas permitiu maior separação de responsabilidades e deixou o projeto mais próximo de padrões utilizados em aplicações profissionais.</w:t>
+      </w:r>
+    </w:p>
+    <w:p>
+      <w:pPr>
         <w:pStyle w:val="Ttulo1"/>
         <w:spacing w:line="360" w:lineRule="auto"/>
         <w:jc w:val="both"/>
@@ -1023,6 +2160,324 @@
     </w:p>
     <w:p>
       <w:pPr>
+        <w:rPr>
+          <w:lang w:val="pt-BR"/>
+        </w:rPr>
+      </w:pPr>
+      <w:r>
+        <w:rPr>
+          <w:lang w:val="pt-BR"/>
+        </w:rPr>
+        <w:t>Durante o desenvolvimento do sistema foram implementadas funcionalidades essenciais para o gerenciamento hospitalar através de uma API REST.</w:t>
+      </w:r>
+    </w:p>
+    <w:p>
+      <w:pPr>
+        <w:rPr>
+          <w:lang w:val="pt-BR"/>
+        </w:rPr>
+      </w:pPr>
+      <w:r>
+        <w:rPr>
+          <w:lang w:val="pt-BR"/>
+        </w:rPr>
+        <w:t>O sistema permite o cadastro e gerenciamento de usuários, pacientes, médicos e consultas médicas, além de autenticação utilizando JWT.</w:t>
+      </w:r>
+    </w:p>
+    <w:p>
+      <w:pPr>
+        <w:rPr>
+          <w:lang w:val="pt-BR"/>
+        </w:rPr>
+      </w:pPr>
+      <w:r>
+        <w:rPr>
+          <w:lang w:val="pt-BR"/>
+        </w:rPr>
+        <w:t>As principais funcionalidades implementadas foram:</w:t>
+      </w:r>
+    </w:p>
+    <w:p>
+      <w:pPr>
+        <w:rPr>
+          <w:lang w:val="pt-BR"/>
+        </w:rPr>
+      </w:pPr>
+      <w:r>
+        <w:rPr>
+          <w:lang w:val="pt-BR"/>
+        </w:rPr>
+        <w:t>Autenticação de Usuários</w:t>
+      </w:r>
+    </w:p>
+    <w:p>
+      <w:pPr>
+        <w:rPr>
+          <w:lang w:val="pt-BR"/>
+        </w:rPr>
+      </w:pPr>
+      <w:r>
+        <w:rPr>
+          <w:lang w:val="pt-BR"/>
+        </w:rPr>
+        <w:t xml:space="preserve">O sistema realiza autenticação através de CPF e senha, retornando um token JWT para acesso aos </w:t>
+      </w:r>
+      <w:proofErr w:type="spellStart"/>
+      <w:r>
+        <w:rPr>
+          <w:lang w:val="pt-BR"/>
+        </w:rPr>
+        <w:t>endpoints</w:t>
+      </w:r>
+      <w:proofErr w:type="spellEnd"/>
+      <w:r>
+        <w:rPr>
+          <w:lang w:val="pt-BR"/>
+        </w:rPr>
+        <w:t xml:space="preserve"> protegidos da aplicação.</w:t>
+      </w:r>
+    </w:p>
+    <w:p>
+      <w:pPr>
+        <w:rPr>
+          <w:lang w:val="pt-BR"/>
+        </w:rPr>
+      </w:pPr>
+      <w:r>
+        <w:rPr>
+          <w:lang w:val="pt-BR"/>
+        </w:rPr>
+        <w:t>Cadastro de Perfis</w:t>
+      </w:r>
+    </w:p>
+    <w:p>
+      <w:pPr>
+        <w:rPr>
+          <w:lang w:val="pt-BR"/>
+        </w:rPr>
+      </w:pPr>
+      <w:r>
+        <w:rPr>
+          <w:lang w:val="pt-BR"/>
+        </w:rPr>
+        <w:t>Permite o cadastro de diferentes perfis de usuários utilizados no sistema.</w:t>
+      </w:r>
+    </w:p>
+    <w:p>
+      <w:pPr>
+        <w:rPr>
+          <w:lang w:val="pt-BR"/>
+        </w:rPr>
+      </w:pPr>
+      <w:r>
+        <w:rPr>
+          <w:lang w:val="pt-BR"/>
+        </w:rPr>
+        <w:t>Cadastro de Usuários</w:t>
+      </w:r>
+    </w:p>
+    <w:p>
+      <w:pPr>
+        <w:rPr>
+          <w:lang w:val="pt-BR"/>
+        </w:rPr>
+      </w:pPr>
+      <w:r>
+        <w:rPr>
+          <w:lang w:val="pt-BR"/>
+        </w:rPr>
+        <w:t>Responsável pelo gerenciamento de usuários da aplicação, incluindo criação, consulta, atualização e remoção de registros.</w:t>
+      </w:r>
+    </w:p>
+    <w:p>
+      <w:pPr>
+        <w:rPr>
+          <w:lang w:val="pt-BR"/>
+        </w:rPr>
+      </w:pPr>
+      <w:r>
+        <w:rPr>
+          <w:lang w:val="pt-BR"/>
+        </w:rPr>
+        <w:t>Cadastro de Pacientes</w:t>
+      </w:r>
+    </w:p>
+    <w:p>
+      <w:pPr>
+        <w:rPr>
+          <w:lang w:val="pt-BR"/>
+        </w:rPr>
+      </w:pPr>
+      <w:r>
+        <w:rPr>
+          <w:lang w:val="pt-BR"/>
+        </w:rPr>
+        <w:t>Permite registrar pacientes vinculados aos usuários cadastrados no sistema.</w:t>
+      </w:r>
+    </w:p>
+    <w:p>
+      <w:pPr>
+        <w:rPr>
+          <w:lang w:val="pt-BR"/>
+        </w:rPr>
+      </w:pPr>
+      <w:r>
+        <w:rPr>
+          <w:lang w:val="pt-BR"/>
+        </w:rPr>
+        <w:t>Cadastro de Médicos</w:t>
+      </w:r>
+    </w:p>
+    <w:p>
+      <w:pPr>
+        <w:rPr>
+          <w:lang w:val="pt-BR"/>
+        </w:rPr>
+      </w:pPr>
+      <w:r>
+        <w:rPr>
+          <w:lang w:val="pt-BR"/>
+        </w:rPr>
+        <w:t>Responsável pelo gerenciamento de médicos, incluindo especialidade e registro profissional.</w:t>
+      </w:r>
+    </w:p>
+    <w:p>
+      <w:pPr>
+        <w:rPr>
+          <w:lang w:val="pt-BR"/>
+        </w:rPr>
+      </w:pPr>
+      <w:r>
+        <w:rPr>
+          <w:lang w:val="pt-BR"/>
+        </w:rPr>
+        <w:t>Cadastro de Consultas</w:t>
+      </w:r>
+    </w:p>
+    <w:p>
+      <w:pPr>
+        <w:rPr>
+          <w:lang w:val="pt-BR"/>
+        </w:rPr>
+      </w:pPr>
+      <w:r>
+        <w:rPr>
+          <w:lang w:val="pt-BR"/>
+        </w:rPr>
+        <w:lastRenderedPageBreak/>
+        <w:t>Permite registrar consultas médicas relacionando pacientes e médicos.</w:t>
+      </w:r>
+    </w:p>
+    <w:p>
+      <w:pPr>
+        <w:rPr>
+          <w:lang w:val="pt-BR"/>
+        </w:rPr>
+      </w:pPr>
+      <w:r>
+        <w:rPr>
+          <w:lang w:val="pt-BR"/>
+        </w:rPr>
+        <w:t>Persistência de Dados</w:t>
+      </w:r>
+    </w:p>
+    <w:p>
+      <w:pPr>
+        <w:rPr>
+          <w:lang w:val="pt-BR"/>
+        </w:rPr>
+      </w:pPr>
+      <w:r>
+        <w:rPr>
+          <w:lang w:val="pt-BR"/>
+        </w:rPr>
+        <w:t>O sistema utiliza banco de dados H2 persistente em arquivo, permitindo manter os dados salvos mesmo após reiniciar a aplicação.</w:t>
+      </w:r>
+    </w:p>
+    <w:p>
+      <w:pPr>
+        <w:rPr>
+          <w:lang w:val="pt-BR"/>
+        </w:rPr>
+      </w:pPr>
+      <w:r>
+        <w:rPr>
+          <w:lang w:val="pt-BR"/>
+        </w:rPr>
+        <w:t>Documentação da API</w:t>
+      </w:r>
+    </w:p>
+    <w:p>
+      <w:pPr>
+        <w:rPr>
+          <w:lang w:val="pt-BR"/>
+        </w:rPr>
+      </w:pPr>
+      <w:r>
+        <w:rPr>
+          <w:lang w:val="pt-BR"/>
+        </w:rPr>
+        <w:t>Foi implementada documentação automática utilizando Swagger/</w:t>
+      </w:r>
+      <w:proofErr w:type="spellStart"/>
+      <w:r>
+        <w:rPr>
+          <w:lang w:val="pt-BR"/>
+        </w:rPr>
+        <w:t>OpenAPI</w:t>
+      </w:r>
+      <w:proofErr w:type="spellEnd"/>
+      <w:r>
+        <w:rPr>
+          <w:lang w:val="pt-BR"/>
+        </w:rPr>
+        <w:t xml:space="preserve">, permitindo visualização e testes dos </w:t>
+      </w:r>
+      <w:proofErr w:type="spellStart"/>
+      <w:r>
+        <w:rPr>
+          <w:lang w:val="pt-BR"/>
+        </w:rPr>
+        <w:t>endpoints</w:t>
+      </w:r>
+      <w:proofErr w:type="spellEnd"/>
+      <w:r>
+        <w:rPr>
+          <w:lang w:val="pt-BR"/>
+        </w:rPr>
+        <w:t xml:space="preserve"> diretamente pelo navegador.</w:t>
+      </w:r>
+    </w:p>
+    <w:p>
+      <w:pPr>
+        <w:rPr>
+          <w:lang w:val="pt-BR"/>
+        </w:rPr>
+      </w:pPr>
+      <w:proofErr w:type="spellStart"/>
+      <w:r>
+        <w:rPr>
+          <w:lang w:val="pt-BR"/>
+        </w:rPr>
+        <w:t>Dockerização</w:t>
+      </w:r>
+      <w:proofErr w:type="spellEnd"/>
+    </w:p>
+    <w:p>
+      <w:pPr>
+        <w:rPr>
+          <w:lang w:val="pt-BR"/>
+        </w:rPr>
+      </w:pPr>
+      <w:r>
+        <w:rPr>
+          <w:lang w:val="pt-BR"/>
+        </w:rPr>
+        <w:t>O projeto foi configurado para execução através de Docker, permitindo maior portabilidade e facilidade de configuração do ambiente.</w:t>
+      </w:r>
+    </w:p>
+    <w:p>
+      <w:pPr>
         <w:pStyle w:val="Ttulo1"/>
         <w:spacing w:line="360" w:lineRule="auto"/>
         <w:jc w:val="both"/>
@@ -1049,6 +2504,313 @@
     </w:p>
     <w:p>
       <w:pPr>
+        <w:rPr>
+          <w:lang w:val="pt-BR"/>
+        </w:rPr>
+      </w:pPr>
+      <w:r>
+        <w:rPr>
+          <w:lang w:val="pt-BR"/>
+        </w:rPr>
+        <w:t xml:space="preserve">A autenticação do sistema foi desenvolvida utilizando JWT (JSON Web Token), permitindo maior segurança no acesso aos </w:t>
+      </w:r>
+      <w:proofErr w:type="spellStart"/>
+      <w:r>
+        <w:rPr>
+          <w:lang w:val="pt-BR"/>
+        </w:rPr>
+        <w:t>endpoints</w:t>
+      </w:r>
+      <w:proofErr w:type="spellEnd"/>
+      <w:r>
+        <w:rPr>
+          <w:lang w:val="pt-BR"/>
+        </w:rPr>
+        <w:t xml:space="preserve"> da aplicação.</w:t>
+      </w:r>
+    </w:p>
+    <w:p>
+      <w:pPr>
+        <w:rPr>
+          <w:lang w:val="pt-BR"/>
+        </w:rPr>
+      </w:pPr>
+      <w:r>
+        <w:rPr>
+          <w:lang w:val="pt-BR"/>
+        </w:rPr>
+        <w:t xml:space="preserve">O processo de autenticação ocorre através do </w:t>
+      </w:r>
+      <w:proofErr w:type="spellStart"/>
+      <w:r>
+        <w:rPr>
+          <w:lang w:val="pt-BR"/>
+        </w:rPr>
+        <w:t>endpoint</w:t>
+      </w:r>
+      <w:proofErr w:type="spellEnd"/>
+      <w:r>
+        <w:rPr>
+          <w:lang w:val="pt-BR"/>
+        </w:rPr>
+        <w:t xml:space="preserve"> de login, onde o usuário informa CPF e senha cadastrados no sistema. Após validação das credenciais, a aplicação gera um token JWT que pode ser utilizado para autenticação nas requisições seguintes.</w:t>
+      </w:r>
+    </w:p>
+    <w:p>
+      <w:pPr>
+        <w:rPr>
+          <w:lang w:val="pt-BR"/>
+        </w:rPr>
+      </w:pPr>
+      <w:r>
+        <w:rPr>
+          <w:lang w:val="pt-BR"/>
+        </w:rPr>
+        <w:t>A utilização do JWT permite que a aplicação mantenha autenticação de forma segura sem necessidade de armazenamento de sessão no servidor.</w:t>
+      </w:r>
+    </w:p>
+    <w:p>
+      <w:pPr>
+        <w:rPr>
+          <w:lang w:val="pt-BR"/>
+        </w:rPr>
+      </w:pPr>
+      <w:r>
+        <w:rPr>
+          <w:lang w:val="pt-BR"/>
+        </w:rPr>
+        <w:t xml:space="preserve">Durante o desenvolvimento foram utilizados recursos do Spring Security para configuração da segurança da aplicação e </w:t>
+      </w:r>
+      <w:proofErr w:type="spellStart"/>
+      <w:r>
+        <w:rPr>
+          <w:lang w:val="pt-BR"/>
+        </w:rPr>
+        <w:t>BCrypt</w:t>
+      </w:r>
+      <w:proofErr w:type="spellEnd"/>
+      <w:r>
+        <w:rPr>
+          <w:lang w:val="pt-BR"/>
+        </w:rPr>
+        <w:t xml:space="preserve"> para criptografia de senhas.</w:t>
+      </w:r>
+    </w:p>
+    <w:p>
+      <w:pPr>
+        <w:rPr>
+          <w:lang w:val="pt-BR"/>
+        </w:rPr>
+      </w:pPr>
+      <w:r>
+        <w:rPr>
+          <w:lang w:val="pt-BR"/>
+        </w:rPr>
+        <w:t xml:space="preserve">O </w:t>
+      </w:r>
+      <w:proofErr w:type="spellStart"/>
+      <w:r>
+        <w:rPr>
+          <w:lang w:val="pt-BR"/>
+        </w:rPr>
+        <w:t>endpoint</w:t>
+      </w:r>
+      <w:proofErr w:type="spellEnd"/>
+      <w:r>
+        <w:rPr>
+          <w:lang w:val="pt-BR"/>
+        </w:rPr>
+        <w:t xml:space="preserve"> utilizado para autenticação foi:</w:t>
+      </w:r>
+    </w:p>
+    <w:p>
+      <w:pPr>
+        <w:rPr>
+          <w:lang w:val="pt-BR"/>
+        </w:rPr>
+      </w:pPr>
+      <w:r>
+        <w:rPr>
+          <w:lang w:val="pt-BR"/>
+        </w:rPr>
+        <w:t>POST /</w:t>
+      </w:r>
+      <w:proofErr w:type="spellStart"/>
+      <w:r>
+        <w:rPr>
+          <w:lang w:val="pt-BR"/>
+        </w:rPr>
+        <w:t>auth</w:t>
+      </w:r>
+      <w:proofErr w:type="spellEnd"/>
+      <w:r>
+        <w:rPr>
+          <w:lang w:val="pt-BR"/>
+        </w:rPr>
+        <w:t>/login</w:t>
+      </w:r>
+    </w:p>
+    <w:p>
+      <w:pPr>
+        <w:rPr>
+          <w:lang w:val="pt-BR"/>
+        </w:rPr>
+      </w:pPr>
+      <w:r>
+        <w:rPr>
+          <w:lang w:val="pt-BR"/>
+        </w:rPr>
+        <w:t>Exemplo de requisição:</w:t>
+      </w:r>
+    </w:p>
+    <w:p>
+      <w:pPr>
+        <w:rPr>
+          <w:lang w:val="pt-BR"/>
+        </w:rPr>
+      </w:pPr>
+      <w:r>
+        <w:rPr>
+          <w:lang w:val="pt-BR"/>
+        </w:rPr>
+        <w:t>{</w:t>
+      </w:r>
+    </w:p>
+    <w:p>
+      <w:pPr>
+        <w:rPr>
+          <w:lang w:val="pt-BR"/>
+        </w:rPr>
+      </w:pPr>
+      <w:r>
+        <w:rPr>
+          <w:lang w:val="pt-BR"/>
+        </w:rPr>
+        <w:t>"</w:t>
+      </w:r>
+      <w:proofErr w:type="spellStart"/>
+      <w:r>
+        <w:rPr>
+          <w:lang w:val="pt-BR"/>
+        </w:rPr>
+        <w:t>cpf</w:t>
+      </w:r>
+      <w:proofErr w:type="spellEnd"/>
+      <w:r>
+        <w:rPr>
+          <w:lang w:val="pt-BR"/>
+        </w:rPr>
+        <w:t>": "99999999999",</w:t>
+      </w:r>
+    </w:p>
+    <w:p>
+      <w:pPr>
+        <w:rPr>
+          <w:lang w:val="pt-BR"/>
+        </w:rPr>
+      </w:pPr>
+      <w:r>
+        <w:rPr>
+          <w:lang w:val="pt-BR"/>
+        </w:rPr>
+        <w:t>"senha": "123"</w:t>
+      </w:r>
+    </w:p>
+    <w:p>
+      <w:pPr>
+        <w:rPr>
+          <w:lang w:val="pt-BR"/>
+        </w:rPr>
+      </w:pPr>
+      <w:r>
+        <w:rPr>
+          <w:lang w:val="pt-BR"/>
+        </w:rPr>
+        <w:t>}</w:t>
+      </w:r>
+    </w:p>
+    <w:p>
+      <w:pPr>
+        <w:rPr>
+          <w:lang w:val="pt-BR"/>
+        </w:rPr>
+      </w:pPr>
+      <w:r>
+        <w:rPr>
+          <w:lang w:val="pt-BR"/>
+        </w:rPr>
+        <w:t>Exemplo de resposta:</w:t>
+      </w:r>
+    </w:p>
+    <w:p>
+      <w:pPr>
+        <w:rPr>
+          <w:lang w:val="pt-BR"/>
+        </w:rPr>
+      </w:pPr>
+      <w:r>
+        <w:rPr>
+          <w:lang w:val="pt-BR"/>
+        </w:rPr>
+        <w:lastRenderedPageBreak/>
+        <w:t>{</w:t>
+      </w:r>
+    </w:p>
+    <w:p>
+      <w:pPr>
+        <w:rPr>
+          <w:lang w:val="pt-BR"/>
+        </w:rPr>
+      </w:pPr>
+      <w:r>
+        <w:rPr>
+          <w:lang w:val="pt-BR"/>
+        </w:rPr>
+        <w:t>"token": "</w:t>
+      </w:r>
+      <w:proofErr w:type="spellStart"/>
+      <w:r>
+        <w:rPr>
+          <w:lang w:val="pt-BR"/>
+        </w:rPr>
+        <w:t>jwt</w:t>
+      </w:r>
+      <w:proofErr w:type="spellEnd"/>
+      <w:r>
+        <w:rPr>
+          <w:lang w:val="pt-BR"/>
+        </w:rPr>
+        <w:t>-token"</w:t>
+      </w:r>
+    </w:p>
+    <w:p>
+      <w:pPr>
+        <w:rPr>
+          <w:lang w:val="pt-BR"/>
+        </w:rPr>
+      </w:pPr>
+      <w:r>
+        <w:rPr>
+          <w:lang w:val="pt-BR"/>
+        </w:rPr>
+        <w:t>}</w:t>
+      </w:r>
+    </w:p>
+    <w:p>
+      <w:pPr>
+        <w:rPr>
+          <w:lang w:val="pt-BR"/>
+        </w:rPr>
+      </w:pPr>
+      <w:r>
+        <w:rPr>
+          <w:lang w:val="pt-BR"/>
+        </w:rPr>
+        <w:t>A implementação da autenticação JWT aproximou o projeto de padrões modernos utilizados no desenvolvimento de APIs profissionais.</w:t>
+      </w:r>
+    </w:p>
+    <w:p>
+      <w:pPr>
         <w:pStyle w:val="Ttulo1"/>
         <w:spacing w:line="360" w:lineRule="auto"/>
         <w:jc w:val="both"/>
@@ -1075,6 +2837,321 @@
     </w:p>
     <w:p>
       <w:pPr>
+        <w:rPr>
+          <w:lang w:val="pt-BR"/>
+        </w:rPr>
+      </w:pPr>
+      <w:r>
+        <w:rPr>
+          <w:lang w:val="pt-BR"/>
+        </w:rPr>
+        <w:t>O sistema utiliza o banco de dados H2 para armazenamento das informações da aplicação.</w:t>
+      </w:r>
+    </w:p>
+    <w:p>
+      <w:pPr>
+        <w:rPr>
+          <w:lang w:val="pt-BR"/>
+        </w:rPr>
+      </w:pPr>
+      <w:r>
+        <w:rPr>
+          <w:lang w:val="pt-BR"/>
+        </w:rPr>
+        <w:t>O H2 foi escolhido por ser um banco leve, simples de configurar e muito utilizado em projetos acadêmicos e ambientes de desenvolvimento.</w:t>
+      </w:r>
+    </w:p>
+    <w:p>
+      <w:pPr>
+        <w:rPr>
+          <w:lang w:val="pt-BR"/>
+        </w:rPr>
+      </w:pPr>
+      <w:r>
+        <w:rPr>
+          <w:lang w:val="pt-BR"/>
+        </w:rPr>
+        <w:t xml:space="preserve">A persistência dos dados foi implementada utilizando Spring Data JPA juntamente com </w:t>
+      </w:r>
+      <w:proofErr w:type="spellStart"/>
+      <w:r>
+        <w:rPr>
+          <w:lang w:val="pt-BR"/>
+        </w:rPr>
+        <w:t>Hibernate</w:t>
+      </w:r>
+      <w:proofErr w:type="spellEnd"/>
+      <w:r>
+        <w:rPr>
+          <w:lang w:val="pt-BR"/>
+        </w:rPr>
+        <w:t>, permitindo o mapeamento das entidades Java para tabelas do banco de dados.</w:t>
+      </w:r>
+    </w:p>
+    <w:p>
+      <w:pPr>
+        <w:rPr>
+          <w:lang w:val="pt-BR"/>
+        </w:rPr>
+      </w:pPr>
+      <w:r>
+        <w:rPr>
+          <w:lang w:val="pt-BR"/>
+        </w:rPr>
+        <w:t>As principais entidades implementadas no sistema foram:</w:t>
+      </w:r>
+    </w:p>
+    <w:p>
+      <w:pPr>
+        <w:rPr>
+          <w:lang w:val="pt-BR"/>
+        </w:rPr>
+      </w:pPr>
+      <w:r>
+        <w:rPr>
+          <w:lang w:val="pt-BR"/>
+        </w:rPr>
+        <w:t>Usuário</w:t>
+      </w:r>
+    </w:p>
+    <w:p>
+      <w:pPr>
+        <w:rPr>
+          <w:lang w:val="pt-BR"/>
+        </w:rPr>
+      </w:pPr>
+      <w:r>
+        <w:rPr>
+          <w:lang w:val="pt-BR"/>
+        </w:rPr>
+        <w:t>Perfil</w:t>
+      </w:r>
+    </w:p>
+    <w:p>
+      <w:pPr>
+        <w:rPr>
+          <w:lang w:val="pt-BR"/>
+        </w:rPr>
+      </w:pPr>
+      <w:r>
+        <w:rPr>
+          <w:lang w:val="pt-BR"/>
+        </w:rPr>
+        <w:t>Paciente</w:t>
+      </w:r>
+    </w:p>
+    <w:p>
+      <w:pPr>
+        <w:rPr>
+          <w:lang w:val="pt-BR"/>
+        </w:rPr>
+      </w:pPr>
+      <w:r>
+        <w:rPr>
+          <w:lang w:val="pt-BR"/>
+        </w:rPr>
+        <w:t>Médico</w:t>
+      </w:r>
+    </w:p>
+    <w:p>
+      <w:pPr>
+        <w:rPr>
+          <w:lang w:val="pt-BR"/>
+        </w:rPr>
+      </w:pPr>
+      <w:r>
+        <w:rPr>
+          <w:lang w:val="pt-BR"/>
+        </w:rPr>
+        <w:t>Consulta</w:t>
+      </w:r>
+    </w:p>
+    <w:p>
+      <w:pPr>
+        <w:rPr>
+          <w:lang w:val="pt-BR"/>
+        </w:rPr>
+      </w:pPr>
+      <w:r>
+        <w:rPr>
+          <w:lang w:val="pt-BR"/>
+        </w:rPr>
+        <w:t>Prontuário</w:t>
+      </w:r>
+    </w:p>
+    <w:p>
+      <w:pPr>
+        <w:rPr>
+          <w:lang w:val="pt-BR"/>
+        </w:rPr>
+      </w:pPr>
+      <w:r>
+        <w:rPr>
+          <w:lang w:val="pt-BR"/>
+        </w:rPr>
+        <w:t>Log de Auditoria</w:t>
+      </w:r>
+    </w:p>
+    <w:p>
+      <w:pPr>
+        <w:rPr>
+          <w:lang w:val="pt-BR"/>
+        </w:rPr>
+      </w:pPr>
+      <w:r>
+        <w:rPr>
+          <w:lang w:val="pt-BR"/>
+        </w:rPr>
+        <w:t>Os relacionamentos entre as entidades foram configurados utilizando anotações JPA, permitindo associação entre usuários, pacientes, médicos e consultas médicas.</w:t>
+      </w:r>
+    </w:p>
+    <w:p>
+      <w:pPr>
+        <w:rPr>
+          <w:lang w:val="pt-BR"/>
+        </w:rPr>
+      </w:pPr>
+      <w:r>
+        <w:rPr>
+          <w:lang w:val="pt-BR"/>
+        </w:rPr>
+        <w:t>O banco foi configurado para persistência em arquivo, permitindo manter os dados armazenados mesmo após reiniciar a aplicação.</w:t>
+      </w:r>
+    </w:p>
+    <w:p>
+      <w:pPr>
+        <w:rPr>
+          <w:lang w:val="pt-BR"/>
+        </w:rPr>
+      </w:pPr>
+      <w:r>
+        <w:rPr>
+          <w:lang w:val="pt-BR"/>
+        </w:rPr>
+        <w:t>Também foi utilizada a ferramenta H2 Console para visualização e gerenciamento do banco durante o desenvolvimento do projeto.</w:t>
+      </w:r>
+    </w:p>
+    <w:p>
+      <w:pPr>
+        <w:rPr>
+          <w:lang w:val="pt-BR"/>
+        </w:rPr>
+      </w:pPr>
+      <w:r>
+        <w:rPr>
+          <w:lang w:val="pt-BR"/>
+        </w:rPr>
+        <w:t>Configuração utilizada:</w:t>
+      </w:r>
+    </w:p>
+    <w:p>
+      <w:pPr>
+        <w:rPr>
+          <w:lang w:val="pt-BR"/>
+        </w:rPr>
+      </w:pPr>
+    </w:p>
+    <w:p>
+      <w:pPr>
+        <w:rPr>
+          <w:lang w:val="pt-BR"/>
+        </w:rPr>
+      </w:pPr>
+      <w:r>
+        <w:rPr>
+          <w:lang w:val="pt-BR"/>
+        </w:rPr>
+        <w:lastRenderedPageBreak/>
+        <w:t>JDBC URL: jdbc:h2:file</w:t>
+      </w:r>
+      <w:proofErr w:type="gramStart"/>
+      <w:r>
+        <w:rPr>
+          <w:lang w:val="pt-BR"/>
+        </w:rPr>
+        <w:t>:./</w:t>
+      </w:r>
+      <w:proofErr w:type="gramEnd"/>
+      <w:r>
+        <w:rPr>
+          <w:lang w:val="pt-BR"/>
+        </w:rPr>
+        <w:t>data/</w:t>
+      </w:r>
+      <w:proofErr w:type="spellStart"/>
+      <w:r>
+        <w:rPr>
+          <w:lang w:val="pt-BR"/>
+        </w:rPr>
+        <w:t>sghss</w:t>
+      </w:r>
+      <w:proofErr w:type="spellEnd"/>
+    </w:p>
+    <w:p>
+      <w:pPr>
+        <w:rPr>
+          <w:lang w:val="pt-BR"/>
+        </w:rPr>
+      </w:pPr>
+      <w:proofErr w:type="spellStart"/>
+      <w:r>
+        <w:rPr>
+          <w:lang w:val="pt-BR"/>
+        </w:rPr>
+        <w:t>User</w:t>
+      </w:r>
+      <w:proofErr w:type="spellEnd"/>
+      <w:r>
+        <w:rPr>
+          <w:lang w:val="pt-BR"/>
+        </w:rPr>
+        <w:t xml:space="preserve">: </w:t>
+      </w:r>
+      <w:proofErr w:type="spellStart"/>
+      <w:r>
+        <w:rPr>
+          <w:lang w:val="pt-BR"/>
+        </w:rPr>
+        <w:t>sa</w:t>
+      </w:r>
+      <w:proofErr w:type="spellEnd"/>
+    </w:p>
+    <w:p>
+      <w:pPr>
+        <w:rPr>
+          <w:lang w:val="pt-BR"/>
+        </w:rPr>
+      </w:pPr>
+      <w:proofErr w:type="spellStart"/>
+      <w:r>
+        <w:rPr>
+          <w:lang w:val="pt-BR"/>
+        </w:rPr>
+        <w:t>Password</w:t>
+      </w:r>
+      <w:proofErr w:type="spellEnd"/>
+      <w:r>
+        <w:rPr>
+          <w:lang w:val="pt-BR"/>
+        </w:rPr>
+        <w:t>: (vazio)</w:t>
+      </w:r>
+    </w:p>
+    <w:p>
+      <w:pPr>
+        <w:rPr>
+          <w:lang w:val="pt-BR"/>
+        </w:rPr>
+      </w:pPr>
+      <w:r>
+        <w:rPr>
+          <w:lang w:val="pt-BR"/>
+        </w:rPr>
+        <w:t>A utilização do Spring Data JPA facilitou significativamente as operações de persistência e manipulação dos dados da aplicação.</w:t>
+      </w:r>
+    </w:p>
+    <w:p>
+      <w:pPr>
         <w:pStyle w:val="Ttulo1"/>
         <w:spacing w:line="360" w:lineRule="auto"/>
         <w:jc w:val="both"/>
@@ -1083,7 +3160,6 @@
           <w:b/>
           <w:bCs/>
           <w:color w:val="auto"/>
-          <w:lang w:val="pt-BR"/>
         </w:rPr>
       </w:pPr>
       <w:bookmarkStart w:id="7" w:name="_Toc228922817"/>
@@ -1095,41 +3171,588 @@
           <w:color w:val="auto"/>
           <w:lang w:val="pt-BR"/>
         </w:rPr>
-        <w:t>8. Testes Realizados</w:t>
+        <w:t xml:space="preserve">8. </w:t>
       </w:r>
       <w:bookmarkEnd w:id="7"/>
-    </w:p>
-    <w:p>
-      <w:pPr>
-        <w:pStyle w:val="Ttulo1"/>
-        <w:spacing w:line="360" w:lineRule="auto"/>
-        <w:jc w:val="both"/>
+      <w:proofErr w:type="spellStart"/>
+      <w:r>
         <w:rPr>
           <w:rFonts w:ascii="Arial" w:hAnsi="Arial" w:cs="Arial"/>
           <w:b/>
           <w:bCs/>
           <w:color w:val="auto"/>
-          <w:lang w:val="pt-BR"/>
-        </w:rPr>
-      </w:pPr>
-      <w:bookmarkStart w:id="8" w:name="_Toc228922818"/>
-      <w:r>
+        </w:rPr>
+        <w:t>Dockerização</w:t>
+      </w:r>
+      <w:proofErr w:type="spellEnd"/>
+    </w:p>
+    <w:p>
+      <w:r>
+        <w:t xml:space="preserve">Durante o </w:t>
+      </w:r>
+      <w:proofErr w:type="spellStart"/>
+      <w:r>
+        <w:t>desenvolvimento</w:t>
+      </w:r>
+      <w:proofErr w:type="spellEnd"/>
+      <w:r>
+        <w:t xml:space="preserve"> do </w:t>
+      </w:r>
+      <w:proofErr w:type="spellStart"/>
+      <w:r>
+        <w:t>projeto</w:t>
+      </w:r>
+      <w:proofErr w:type="spellEnd"/>
+      <w:r>
+        <w:t xml:space="preserve"> </w:t>
+      </w:r>
+      <w:proofErr w:type="spellStart"/>
+      <w:r>
+        <w:t>foi</w:t>
+      </w:r>
+      <w:proofErr w:type="spellEnd"/>
+      <w:r>
+        <w:t xml:space="preserve"> </w:t>
+      </w:r>
+      <w:proofErr w:type="spellStart"/>
+      <w:r>
+        <w:t>implementada</w:t>
+      </w:r>
+      <w:proofErr w:type="spellEnd"/>
+      <w:r>
+        <w:t xml:space="preserve"> a </w:t>
+      </w:r>
+      <w:proofErr w:type="spellStart"/>
+      <w:r>
+        <w:t>dockerização</w:t>
+      </w:r>
+      <w:proofErr w:type="spellEnd"/>
+      <w:r>
+        <w:t xml:space="preserve"> da </w:t>
+      </w:r>
+      <w:proofErr w:type="spellStart"/>
+      <w:r>
+        <w:t>aplicação</w:t>
+      </w:r>
+      <w:proofErr w:type="spellEnd"/>
+      <w:r>
+        <w:t xml:space="preserve"> </w:t>
+      </w:r>
+      <w:proofErr w:type="spellStart"/>
+      <w:r>
+        <w:t>utilizando</w:t>
+      </w:r>
+      <w:proofErr w:type="spellEnd"/>
+      <w:r>
+        <w:t xml:space="preserve"> Docker e Docker Compose.</w:t>
+      </w:r>
+    </w:p>
+    <w:p>
+      <w:r>
+        <w:t xml:space="preserve">A </w:t>
+      </w:r>
+      <w:proofErr w:type="spellStart"/>
+      <w:r>
+        <w:t>utilização</w:t>
+      </w:r>
+      <w:proofErr w:type="spellEnd"/>
+      <w:r>
+        <w:t xml:space="preserve"> do Docker </w:t>
+      </w:r>
+      <w:proofErr w:type="spellStart"/>
+      <w:r>
+        <w:t>permitiu</w:t>
+      </w:r>
+      <w:proofErr w:type="spellEnd"/>
+      <w:r>
+        <w:t xml:space="preserve"> </w:t>
+      </w:r>
+      <w:proofErr w:type="spellStart"/>
+      <w:r>
+        <w:t>criar</w:t>
+      </w:r>
+      <w:proofErr w:type="spellEnd"/>
+      <w:r>
+        <w:t xml:space="preserve"> um </w:t>
+      </w:r>
+      <w:proofErr w:type="spellStart"/>
+      <w:r>
+        <w:t>ambiente</w:t>
+      </w:r>
+      <w:proofErr w:type="spellEnd"/>
+      <w:r>
+        <w:t xml:space="preserve"> </w:t>
+      </w:r>
+      <w:proofErr w:type="spellStart"/>
+      <w:r>
+        <w:t>padronizado</w:t>
+      </w:r>
+      <w:proofErr w:type="spellEnd"/>
+      <w:r>
+        <w:t xml:space="preserve"> para </w:t>
+      </w:r>
+      <w:proofErr w:type="spellStart"/>
+      <w:r>
+        <w:t>execução</w:t>
+      </w:r>
+      <w:proofErr w:type="spellEnd"/>
+      <w:r>
+        <w:t xml:space="preserve"> do </w:t>
+      </w:r>
+      <w:proofErr w:type="spellStart"/>
+      <w:r>
+        <w:t>sistema</w:t>
+      </w:r>
+      <w:proofErr w:type="spellEnd"/>
+      <w:r>
+        <w:t xml:space="preserve">, </w:t>
+      </w:r>
+      <w:proofErr w:type="spellStart"/>
+      <w:r>
+        <w:t>eliminando</w:t>
+      </w:r>
+      <w:proofErr w:type="spellEnd"/>
+      <w:r>
+        <w:t xml:space="preserve"> a </w:t>
+      </w:r>
+      <w:proofErr w:type="spellStart"/>
+      <w:r>
+        <w:t>necessidade</w:t>
+      </w:r>
+      <w:proofErr w:type="spellEnd"/>
+      <w:r>
+        <w:t xml:space="preserve"> de </w:t>
+      </w:r>
+      <w:proofErr w:type="spellStart"/>
+      <w:r>
+        <w:t>instalação</w:t>
+      </w:r>
+      <w:proofErr w:type="spellEnd"/>
+      <w:r>
+        <w:t xml:space="preserve"> manual de </w:t>
+      </w:r>
+      <w:proofErr w:type="spellStart"/>
+      <w:r>
+        <w:t>dependências</w:t>
+      </w:r>
+      <w:proofErr w:type="spellEnd"/>
+      <w:r>
+        <w:t xml:space="preserve"> </w:t>
+      </w:r>
+      <w:proofErr w:type="spellStart"/>
+      <w:r>
+        <w:t>como</w:t>
+      </w:r>
+      <w:proofErr w:type="spellEnd"/>
+      <w:r>
+        <w:t xml:space="preserve"> Java e Maven </w:t>
+      </w:r>
+      <w:proofErr w:type="spellStart"/>
+      <w:r>
+        <w:t>na</w:t>
+      </w:r>
+      <w:proofErr w:type="spellEnd"/>
+      <w:r>
+        <w:t xml:space="preserve"> </w:t>
+      </w:r>
+      <w:proofErr w:type="spellStart"/>
+      <w:r>
+        <w:t>máquina</w:t>
+      </w:r>
+      <w:proofErr w:type="spellEnd"/>
+      <w:r>
+        <w:t xml:space="preserve"> do </w:t>
+      </w:r>
+      <w:proofErr w:type="spellStart"/>
+      <w:r>
+        <w:t>usuário</w:t>
+      </w:r>
+      <w:proofErr w:type="spellEnd"/>
+      <w:r>
+        <w:t>.</w:t>
+      </w:r>
+    </w:p>
+    <w:p>
+      <w:proofErr w:type="spellStart"/>
+      <w:r>
+        <w:t>Foram</w:t>
+      </w:r>
+      <w:proofErr w:type="spellEnd"/>
+      <w:r>
+        <w:t xml:space="preserve"> </w:t>
+      </w:r>
+      <w:proofErr w:type="spellStart"/>
+      <w:r>
+        <w:t>criados</w:t>
+      </w:r>
+      <w:proofErr w:type="spellEnd"/>
+      <w:r>
+        <w:t xml:space="preserve"> </w:t>
+      </w:r>
+      <w:proofErr w:type="spellStart"/>
+      <w:r>
+        <w:t>os</w:t>
+      </w:r>
+      <w:proofErr w:type="spellEnd"/>
+      <w:r>
+        <w:t xml:space="preserve"> </w:t>
+      </w:r>
+      <w:proofErr w:type="spellStart"/>
+      <w:r>
+        <w:t>arquivos</w:t>
+      </w:r>
+      <w:proofErr w:type="spellEnd"/>
+      <w:r>
+        <w:t xml:space="preserve"> </w:t>
+      </w:r>
+      <w:proofErr w:type="spellStart"/>
+      <w:r>
+        <w:t>Dockerfile</w:t>
+      </w:r>
+      <w:proofErr w:type="spellEnd"/>
+      <w:r>
+        <w:t>, docker-</w:t>
+      </w:r>
+      <w:proofErr w:type="spellStart"/>
+      <w:r>
+        <w:t>compose.yml</w:t>
+      </w:r>
+      <w:proofErr w:type="spellEnd"/>
+      <w:r>
+        <w:t xml:space="preserve"> </w:t>
+      </w:r>
+      <w:proofErr w:type="gramStart"/>
+      <w:r>
+        <w:t>e .</w:t>
+      </w:r>
+      <w:proofErr w:type="spellStart"/>
+      <w:r>
+        <w:t>dockerignore</w:t>
+      </w:r>
+      <w:proofErr w:type="spellEnd"/>
+      <w:proofErr w:type="gramEnd"/>
+      <w:r>
+        <w:t xml:space="preserve"> para </w:t>
+      </w:r>
+      <w:proofErr w:type="spellStart"/>
+      <w:r>
+        <w:t>configuração</w:t>
+      </w:r>
+      <w:proofErr w:type="spellEnd"/>
+      <w:r>
+        <w:t xml:space="preserve"> e </w:t>
+      </w:r>
+      <w:proofErr w:type="spellStart"/>
+      <w:r>
+        <w:t>gerenciamento</w:t>
+      </w:r>
+      <w:proofErr w:type="spellEnd"/>
+      <w:r>
+        <w:t xml:space="preserve"> dos containers da </w:t>
+      </w:r>
+      <w:proofErr w:type="spellStart"/>
+      <w:r>
+        <w:t>aplicação</w:t>
+      </w:r>
+      <w:proofErr w:type="spellEnd"/>
+      <w:r>
+        <w:t>.</w:t>
+      </w:r>
+    </w:p>
+    <w:p>
+      <w:r>
+        <w:t xml:space="preserve">Com a </w:t>
+      </w:r>
+      <w:proofErr w:type="spellStart"/>
+      <w:r>
+        <w:t>dockerização</w:t>
+      </w:r>
+      <w:proofErr w:type="spellEnd"/>
+      <w:r>
+        <w:t xml:space="preserve">, o </w:t>
+      </w:r>
+      <w:proofErr w:type="spellStart"/>
+      <w:r>
+        <w:t>sistema</w:t>
+      </w:r>
+      <w:proofErr w:type="spellEnd"/>
+      <w:r>
+        <w:t xml:space="preserve"> </w:t>
+      </w:r>
+      <w:proofErr w:type="spellStart"/>
+      <w:r>
+        <w:t>pode</w:t>
+      </w:r>
+      <w:proofErr w:type="spellEnd"/>
+      <w:r>
+        <w:t xml:space="preserve"> ser </w:t>
+      </w:r>
+      <w:proofErr w:type="spellStart"/>
+      <w:r>
+        <w:t>executado</w:t>
+      </w:r>
+      <w:proofErr w:type="spellEnd"/>
+      <w:r>
+        <w:t xml:space="preserve"> </w:t>
+      </w:r>
+      <w:proofErr w:type="spellStart"/>
+      <w:r>
+        <w:t>utilizando</w:t>
+      </w:r>
+      <w:proofErr w:type="spellEnd"/>
+      <w:r>
+        <w:t xml:space="preserve"> </w:t>
+      </w:r>
+      <w:proofErr w:type="spellStart"/>
+      <w:r>
+        <w:t>apenas</w:t>
+      </w:r>
+      <w:proofErr w:type="spellEnd"/>
+      <w:r>
+        <w:t xml:space="preserve"> o </w:t>
+      </w:r>
+      <w:proofErr w:type="spellStart"/>
+      <w:r>
+        <w:t>comando</w:t>
+      </w:r>
+      <w:proofErr w:type="spellEnd"/>
+      <w:r>
+        <w:t>:</w:t>
+      </w:r>
+    </w:p>
+    <w:p>
+      <w:r>
+        <w:t>docker compose up --build</w:t>
+      </w:r>
+    </w:p>
+    <w:p>
+      <w:proofErr w:type="spellStart"/>
+      <w:r>
+        <w:t>Após</w:t>
+      </w:r>
+      <w:proofErr w:type="spellEnd"/>
+      <w:r>
+        <w:t xml:space="preserve"> a </w:t>
+      </w:r>
+      <w:proofErr w:type="spellStart"/>
+      <w:r>
+        <w:t>primeira</w:t>
+      </w:r>
+      <w:proofErr w:type="spellEnd"/>
+      <w:r>
+        <w:t xml:space="preserve"> </w:t>
+      </w:r>
+      <w:proofErr w:type="spellStart"/>
+      <w:r>
+        <w:t>execução</w:t>
+      </w:r>
+      <w:proofErr w:type="spellEnd"/>
+      <w:r>
+        <w:t xml:space="preserve">, </w:t>
+      </w:r>
+      <w:proofErr w:type="gramStart"/>
+      <w:r>
+        <w:t>a</w:t>
+      </w:r>
+      <w:proofErr w:type="gramEnd"/>
+      <w:r>
+        <w:t xml:space="preserve"> </w:t>
+      </w:r>
+      <w:proofErr w:type="spellStart"/>
+      <w:r>
+        <w:t>aplicação</w:t>
+      </w:r>
+      <w:proofErr w:type="spellEnd"/>
+      <w:r>
+        <w:t xml:space="preserve"> </w:t>
+      </w:r>
+      <w:proofErr w:type="spellStart"/>
+      <w:r>
+        <w:t>pode</w:t>
+      </w:r>
+      <w:proofErr w:type="spellEnd"/>
+      <w:r>
+        <w:t xml:space="preserve"> ser </w:t>
+      </w:r>
+      <w:proofErr w:type="spellStart"/>
+      <w:r>
+        <w:t>iniciada</w:t>
+      </w:r>
+      <w:proofErr w:type="spellEnd"/>
+      <w:r>
+        <w:t xml:space="preserve"> </w:t>
+      </w:r>
+      <w:proofErr w:type="spellStart"/>
+      <w:r>
+        <w:t>novamente</w:t>
+      </w:r>
+      <w:proofErr w:type="spellEnd"/>
+      <w:r>
+        <w:t xml:space="preserve"> </w:t>
+      </w:r>
+      <w:proofErr w:type="spellStart"/>
+      <w:r>
+        <w:t>utilizando</w:t>
+      </w:r>
+      <w:proofErr w:type="spellEnd"/>
+      <w:r>
+        <w:t>:</w:t>
+      </w:r>
+    </w:p>
+    <w:p>
+      <w:r>
+        <w:t>docker compose up</w:t>
+      </w:r>
+    </w:p>
+    <w:p>
+      <w:r>
+        <w:t xml:space="preserve">Para </w:t>
+      </w:r>
+      <w:proofErr w:type="spellStart"/>
+      <w:r>
+        <w:t>encerramento</w:t>
+      </w:r>
+      <w:proofErr w:type="spellEnd"/>
+      <w:r>
+        <w:t xml:space="preserve"> dos containers </w:t>
+      </w:r>
+      <w:proofErr w:type="spellStart"/>
+      <w:r>
+        <w:t>foi</w:t>
+      </w:r>
+      <w:proofErr w:type="spellEnd"/>
+      <w:r>
+        <w:t xml:space="preserve"> </w:t>
+      </w:r>
+      <w:proofErr w:type="spellStart"/>
+      <w:r>
+        <w:t>utilizado</w:t>
+      </w:r>
+      <w:proofErr w:type="spellEnd"/>
+      <w:r>
+        <w:t>:</w:t>
+      </w:r>
+    </w:p>
+    <w:p>
+      <w:r>
+        <w:t>docker compose down</w:t>
+      </w:r>
+    </w:p>
+    <w:p>
+      <w:r>
+        <w:t xml:space="preserve">A </w:t>
+      </w:r>
+      <w:proofErr w:type="spellStart"/>
+      <w:r>
+        <w:t>utilização</w:t>
+      </w:r>
+      <w:proofErr w:type="spellEnd"/>
+      <w:r>
+        <w:t xml:space="preserve"> do Docker </w:t>
+      </w:r>
+      <w:proofErr w:type="spellStart"/>
+      <w:r>
+        <w:t>trouxe</w:t>
+      </w:r>
+      <w:proofErr w:type="spellEnd"/>
+      <w:r>
+        <w:t xml:space="preserve"> </w:t>
+      </w:r>
+      <w:proofErr w:type="spellStart"/>
+      <w:r>
+        <w:t>maior</w:t>
+      </w:r>
+      <w:proofErr w:type="spellEnd"/>
+      <w:r>
+        <w:t xml:space="preserve"> </w:t>
+      </w:r>
+      <w:proofErr w:type="spellStart"/>
+      <w:r>
+        <w:t>portabilidade</w:t>
+      </w:r>
+      <w:proofErr w:type="spellEnd"/>
+      <w:r>
+        <w:t xml:space="preserve"> </w:t>
+      </w:r>
+      <w:proofErr w:type="spellStart"/>
+      <w:r>
+        <w:t>ao</w:t>
+      </w:r>
+      <w:proofErr w:type="spellEnd"/>
+      <w:r>
+        <w:t xml:space="preserve"> </w:t>
+      </w:r>
+      <w:proofErr w:type="spellStart"/>
+      <w:r>
+        <w:t>projeto</w:t>
+      </w:r>
+      <w:proofErr w:type="spellEnd"/>
+      <w:r>
+        <w:t xml:space="preserve">, </w:t>
+      </w:r>
+      <w:proofErr w:type="spellStart"/>
+      <w:r>
+        <w:t>facilitando</w:t>
+      </w:r>
+      <w:proofErr w:type="spellEnd"/>
+      <w:r>
+        <w:t xml:space="preserve"> testes, </w:t>
+      </w:r>
+      <w:proofErr w:type="spellStart"/>
+      <w:r>
+        <w:t>distribuição</w:t>
+      </w:r>
+      <w:proofErr w:type="spellEnd"/>
+      <w:r>
+        <w:t xml:space="preserve"> e </w:t>
+      </w:r>
+      <w:proofErr w:type="spellStart"/>
+      <w:r>
+        <w:t>execução</w:t>
+      </w:r>
+      <w:proofErr w:type="spellEnd"/>
+      <w:r>
+        <w:t xml:space="preserve"> da </w:t>
+      </w:r>
+      <w:proofErr w:type="spellStart"/>
+      <w:r>
+        <w:t>aplicação</w:t>
+      </w:r>
+      <w:proofErr w:type="spellEnd"/>
+      <w:r>
+        <w:t xml:space="preserve"> </w:t>
+      </w:r>
+      <w:proofErr w:type="spellStart"/>
+      <w:r>
+        <w:t>em</w:t>
+      </w:r>
+      <w:proofErr w:type="spellEnd"/>
+      <w:r>
+        <w:t xml:space="preserve"> </w:t>
+      </w:r>
+      <w:proofErr w:type="spellStart"/>
+      <w:r>
+        <w:t>diferentes</w:t>
+      </w:r>
+      <w:proofErr w:type="spellEnd"/>
+      <w:r>
+        <w:t xml:space="preserve"> ambientes.</w:t>
+      </w:r>
+    </w:p>
+    <w:p>
+      <w:pPr>
+        <w:pStyle w:val="Ttulo1"/>
+        <w:spacing w:line="360" w:lineRule="auto"/>
+        <w:jc w:val="both"/>
         <w:rPr>
           <w:rFonts w:ascii="Arial" w:hAnsi="Arial" w:cs="Arial"/>
           <w:b/>
           <w:bCs/>
           <w:color w:val="auto"/>
-          <w:lang w:val="pt-BR"/>
-        </w:rPr>
-        <w:t>9. Conclusão</w:t>
-      </w:r>
-      <w:bookmarkEnd w:id="8"/>
-    </w:p>
-    <w:p>
-      <w:pPr>
-        <w:pStyle w:val="Ttulo1"/>
-        <w:spacing w:line="360" w:lineRule="auto"/>
-        <w:jc w:val="both"/>
+        </w:rPr>
+      </w:pPr>
+      <w:bookmarkStart w:id="8" w:name="_Toc228922818"/>
+      <w:r>
         <w:rPr>
           <w:rFonts w:ascii="Arial" w:hAnsi="Arial" w:cs="Arial"/>
           <w:b/>
@@ -1137,35 +3760,1598 @@
           <w:color w:val="auto"/>
           <w:lang w:val="pt-BR"/>
         </w:rPr>
-      </w:pPr>
-      <w:bookmarkStart w:id="9" w:name="_Toc228922819"/>
+        <w:t xml:space="preserve">9. </w:t>
+      </w:r>
+      <w:bookmarkEnd w:id="8"/>
       <w:r>
         <w:rPr>
           <w:rFonts w:ascii="Arial" w:hAnsi="Arial" w:cs="Arial"/>
           <w:b/>
           <w:bCs/>
           <w:color w:val="auto"/>
-          <w:lang w:val="pt-BR"/>
-        </w:rPr>
-        <w:t>10. Referências</w:t>
-      </w:r>
-      <w:bookmarkEnd w:id="9"/>
-    </w:p>
-    <w:p>
-      <w:pPr>
-        <w:pStyle w:val="Ttulo1"/>
-        <w:spacing w:line="360" w:lineRule="auto"/>
-        <w:jc w:val="both"/>
+        </w:rPr>
+        <w:t xml:space="preserve">Testes </w:t>
+      </w:r>
+      <w:proofErr w:type="spellStart"/>
+      <w:r>
         <w:rPr>
           <w:rFonts w:ascii="Arial" w:hAnsi="Arial" w:cs="Arial"/>
           <w:b/>
           <w:bCs/>
           <w:color w:val="auto"/>
-          <w:lang w:val="pt-BR"/>
-        </w:rPr>
-      </w:pPr>
-      <w:bookmarkStart w:id="10" w:name="_Toc228922820"/>
-      <w:r>
+        </w:rPr>
+        <w:t>Realizados</w:t>
+      </w:r>
+      <w:proofErr w:type="spellEnd"/>
+    </w:p>
+    <w:p>
+      <w:r>
+        <w:t xml:space="preserve">Durante o </w:t>
+      </w:r>
+      <w:proofErr w:type="spellStart"/>
+      <w:r>
+        <w:t>desenvolvimento</w:t>
+      </w:r>
+      <w:proofErr w:type="spellEnd"/>
+      <w:r>
+        <w:t xml:space="preserve"> do </w:t>
+      </w:r>
+      <w:proofErr w:type="spellStart"/>
+      <w:r>
+        <w:t>sistema</w:t>
+      </w:r>
+      <w:proofErr w:type="spellEnd"/>
+      <w:r>
+        <w:t xml:space="preserve"> </w:t>
+      </w:r>
+      <w:proofErr w:type="spellStart"/>
+      <w:r>
+        <w:t>foram</w:t>
+      </w:r>
+      <w:proofErr w:type="spellEnd"/>
+      <w:r>
+        <w:t xml:space="preserve"> </w:t>
+      </w:r>
+      <w:proofErr w:type="spellStart"/>
+      <w:r>
+        <w:t>realizados</w:t>
+      </w:r>
+      <w:proofErr w:type="spellEnd"/>
+      <w:r>
+        <w:t xml:space="preserve"> testes </w:t>
+      </w:r>
+      <w:proofErr w:type="spellStart"/>
+      <w:r>
+        <w:t>utilizando</w:t>
+      </w:r>
+      <w:proofErr w:type="spellEnd"/>
+      <w:r>
+        <w:t xml:space="preserve"> Swagger/</w:t>
+      </w:r>
+      <w:proofErr w:type="spellStart"/>
+      <w:r>
+        <w:t>OpenAPI</w:t>
+      </w:r>
+      <w:proofErr w:type="spellEnd"/>
+      <w:r>
+        <w:t xml:space="preserve"> para </w:t>
+      </w:r>
+      <w:proofErr w:type="spellStart"/>
+      <w:r>
+        <w:t>validação</w:t>
+      </w:r>
+      <w:proofErr w:type="spellEnd"/>
+      <w:r>
+        <w:t xml:space="preserve"> dos endpoints da API REST.</w:t>
+      </w:r>
+    </w:p>
+    <w:p>
+      <w:proofErr w:type="spellStart"/>
+      <w:r>
+        <w:t>Os</w:t>
+      </w:r>
+      <w:proofErr w:type="spellEnd"/>
+      <w:r>
+        <w:t xml:space="preserve"> testes </w:t>
+      </w:r>
+      <w:proofErr w:type="spellStart"/>
+      <w:r>
+        <w:t>permitiram</w:t>
+      </w:r>
+      <w:proofErr w:type="spellEnd"/>
+      <w:r>
+        <w:t xml:space="preserve"> </w:t>
+      </w:r>
+      <w:proofErr w:type="spellStart"/>
+      <w:r>
+        <w:t>validar</w:t>
+      </w:r>
+      <w:proofErr w:type="spellEnd"/>
+      <w:r>
+        <w:t xml:space="preserve"> o </w:t>
+      </w:r>
+      <w:proofErr w:type="spellStart"/>
+      <w:r>
+        <w:t>funcionamento</w:t>
+      </w:r>
+      <w:proofErr w:type="spellEnd"/>
+      <w:r>
+        <w:t xml:space="preserve"> das </w:t>
+      </w:r>
+      <w:proofErr w:type="spellStart"/>
+      <w:r>
+        <w:t>operações</w:t>
+      </w:r>
+      <w:proofErr w:type="spellEnd"/>
+      <w:r>
+        <w:t xml:space="preserve"> de </w:t>
+      </w:r>
+      <w:proofErr w:type="spellStart"/>
+      <w:r>
+        <w:t>cadastro</w:t>
+      </w:r>
+      <w:proofErr w:type="spellEnd"/>
+      <w:r>
+        <w:t xml:space="preserve">, </w:t>
+      </w:r>
+      <w:proofErr w:type="spellStart"/>
+      <w:r>
+        <w:t>listagem</w:t>
+      </w:r>
+      <w:proofErr w:type="spellEnd"/>
+      <w:r>
+        <w:t xml:space="preserve">, </w:t>
+      </w:r>
+      <w:proofErr w:type="spellStart"/>
+      <w:r>
+        <w:t>autenticação</w:t>
+      </w:r>
+      <w:proofErr w:type="spellEnd"/>
+      <w:r>
+        <w:t xml:space="preserve"> e </w:t>
+      </w:r>
+      <w:proofErr w:type="spellStart"/>
+      <w:r>
+        <w:t>relacionamento</w:t>
+      </w:r>
+      <w:proofErr w:type="spellEnd"/>
+      <w:r>
+        <w:t xml:space="preserve"> entre as </w:t>
+      </w:r>
+      <w:proofErr w:type="spellStart"/>
+      <w:r>
+        <w:t>entidades</w:t>
+      </w:r>
+      <w:proofErr w:type="spellEnd"/>
+      <w:r>
+        <w:t xml:space="preserve"> do </w:t>
+      </w:r>
+      <w:proofErr w:type="spellStart"/>
+      <w:r>
+        <w:t>sistema</w:t>
+      </w:r>
+      <w:proofErr w:type="spellEnd"/>
+      <w:r>
+        <w:t>.</w:t>
+      </w:r>
+    </w:p>
+    <w:p>
+      <w:proofErr w:type="spellStart"/>
+      <w:r>
+        <w:t>Os</w:t>
+      </w:r>
+      <w:proofErr w:type="spellEnd"/>
+      <w:r>
+        <w:t xml:space="preserve"> </w:t>
+      </w:r>
+      <w:proofErr w:type="spellStart"/>
+      <w:r>
+        <w:t>principais</w:t>
+      </w:r>
+      <w:proofErr w:type="spellEnd"/>
+      <w:r>
+        <w:t xml:space="preserve"> testes </w:t>
+      </w:r>
+      <w:proofErr w:type="spellStart"/>
+      <w:r>
+        <w:t>realizados</w:t>
+      </w:r>
+      <w:proofErr w:type="spellEnd"/>
+      <w:r>
+        <w:t xml:space="preserve"> </w:t>
+      </w:r>
+      <w:proofErr w:type="spellStart"/>
+      <w:r>
+        <w:t>foram</w:t>
+      </w:r>
+      <w:proofErr w:type="spellEnd"/>
+      <w:r>
+        <w:t>:</w:t>
+      </w:r>
+    </w:p>
+    <w:p>
+      <w:r>
+        <w:t xml:space="preserve">Teste de </w:t>
+      </w:r>
+      <w:proofErr w:type="spellStart"/>
+      <w:r>
+        <w:t>autenticação</w:t>
+      </w:r>
+      <w:proofErr w:type="spellEnd"/>
+      <w:r>
+        <w:t xml:space="preserve"> JWT</w:t>
+      </w:r>
+    </w:p>
+    <w:p>
+      <w:proofErr w:type="spellStart"/>
+      <w:r>
+        <w:lastRenderedPageBreak/>
+        <w:t>Foi</w:t>
+      </w:r>
+      <w:proofErr w:type="spellEnd"/>
+      <w:r>
+        <w:t xml:space="preserve"> </w:t>
+      </w:r>
+      <w:proofErr w:type="spellStart"/>
+      <w:r>
+        <w:t>realizado</w:t>
+      </w:r>
+      <w:proofErr w:type="spellEnd"/>
+      <w:r>
+        <w:t xml:space="preserve"> teste do endpoint de login para </w:t>
+      </w:r>
+      <w:proofErr w:type="spellStart"/>
+      <w:r>
+        <w:t>validação</w:t>
+      </w:r>
+      <w:proofErr w:type="spellEnd"/>
+      <w:r>
+        <w:t xml:space="preserve"> das </w:t>
+      </w:r>
+      <w:proofErr w:type="spellStart"/>
+      <w:r>
+        <w:t>credenciais</w:t>
+      </w:r>
+      <w:proofErr w:type="spellEnd"/>
+      <w:r>
+        <w:t xml:space="preserve"> do </w:t>
+      </w:r>
+      <w:proofErr w:type="spellStart"/>
+      <w:r>
+        <w:t>usuário</w:t>
+      </w:r>
+      <w:proofErr w:type="spellEnd"/>
+      <w:r>
+        <w:t xml:space="preserve"> e </w:t>
+      </w:r>
+      <w:proofErr w:type="spellStart"/>
+      <w:r>
+        <w:t>geração</w:t>
+      </w:r>
+      <w:proofErr w:type="spellEnd"/>
+      <w:r>
+        <w:t xml:space="preserve"> do token JWT.</w:t>
+      </w:r>
+    </w:p>
+    <w:p>
+      <w:r>
+        <w:t xml:space="preserve">Teste de </w:t>
+      </w:r>
+      <w:proofErr w:type="spellStart"/>
+      <w:r>
+        <w:t>cadastro</w:t>
+      </w:r>
+      <w:proofErr w:type="spellEnd"/>
+      <w:r>
+        <w:t xml:space="preserve"> de </w:t>
+      </w:r>
+      <w:proofErr w:type="spellStart"/>
+      <w:r>
+        <w:t>usuários</w:t>
+      </w:r>
+      <w:proofErr w:type="spellEnd"/>
+    </w:p>
+    <w:p>
+      <w:proofErr w:type="spellStart"/>
+      <w:r>
+        <w:t>Foram</w:t>
+      </w:r>
+      <w:proofErr w:type="spellEnd"/>
+      <w:r>
+        <w:t xml:space="preserve"> </w:t>
+      </w:r>
+      <w:proofErr w:type="spellStart"/>
+      <w:r>
+        <w:t>realizados</w:t>
+      </w:r>
+      <w:proofErr w:type="spellEnd"/>
+      <w:r>
+        <w:t xml:space="preserve"> testes de </w:t>
+      </w:r>
+      <w:proofErr w:type="spellStart"/>
+      <w:r>
+        <w:t>criação</w:t>
+      </w:r>
+      <w:proofErr w:type="spellEnd"/>
+      <w:r>
+        <w:t xml:space="preserve"> e </w:t>
+      </w:r>
+      <w:proofErr w:type="spellStart"/>
+      <w:r>
+        <w:t>listagem</w:t>
+      </w:r>
+      <w:proofErr w:type="spellEnd"/>
+      <w:r>
+        <w:t xml:space="preserve"> de </w:t>
+      </w:r>
+      <w:proofErr w:type="spellStart"/>
+      <w:r>
+        <w:t>usuários</w:t>
+      </w:r>
+      <w:proofErr w:type="spellEnd"/>
+      <w:r>
+        <w:t xml:space="preserve"> </w:t>
+      </w:r>
+      <w:proofErr w:type="spellStart"/>
+      <w:r>
+        <w:t>cadastrados</w:t>
+      </w:r>
+      <w:proofErr w:type="spellEnd"/>
+      <w:r>
+        <w:t xml:space="preserve"> no </w:t>
+      </w:r>
+      <w:proofErr w:type="spellStart"/>
+      <w:r>
+        <w:t>sistema</w:t>
+      </w:r>
+      <w:proofErr w:type="spellEnd"/>
+      <w:r>
+        <w:t>.</w:t>
+      </w:r>
+    </w:p>
+    <w:p>
+      <w:r>
+        <w:t xml:space="preserve">Teste de </w:t>
+      </w:r>
+      <w:proofErr w:type="spellStart"/>
+      <w:r>
+        <w:t>cadastro</w:t>
+      </w:r>
+      <w:proofErr w:type="spellEnd"/>
+      <w:r>
+        <w:t xml:space="preserve"> de </w:t>
+      </w:r>
+      <w:proofErr w:type="spellStart"/>
+      <w:r>
+        <w:t>pacientes</w:t>
+      </w:r>
+      <w:proofErr w:type="spellEnd"/>
+    </w:p>
+    <w:p>
+      <w:proofErr w:type="spellStart"/>
+      <w:r>
+        <w:t>Foi</w:t>
+      </w:r>
+      <w:proofErr w:type="spellEnd"/>
+      <w:r>
+        <w:t xml:space="preserve"> </w:t>
+      </w:r>
+      <w:proofErr w:type="spellStart"/>
+      <w:r>
+        <w:t>validado</w:t>
+      </w:r>
+      <w:proofErr w:type="spellEnd"/>
+      <w:r>
+        <w:t xml:space="preserve"> o </w:t>
+      </w:r>
+      <w:proofErr w:type="spellStart"/>
+      <w:r>
+        <w:t>relacionamento</w:t>
+      </w:r>
+      <w:proofErr w:type="spellEnd"/>
+      <w:r>
+        <w:t xml:space="preserve"> entre </w:t>
+      </w:r>
+      <w:proofErr w:type="spellStart"/>
+      <w:r>
+        <w:t>usuários</w:t>
+      </w:r>
+      <w:proofErr w:type="spellEnd"/>
+      <w:r>
+        <w:t xml:space="preserve"> e </w:t>
+      </w:r>
+      <w:proofErr w:type="spellStart"/>
+      <w:r>
+        <w:t>pacientes</w:t>
+      </w:r>
+      <w:proofErr w:type="spellEnd"/>
+      <w:r>
+        <w:t xml:space="preserve"> </w:t>
+      </w:r>
+      <w:proofErr w:type="spellStart"/>
+      <w:r>
+        <w:t>através</w:t>
+      </w:r>
+      <w:proofErr w:type="spellEnd"/>
+      <w:r>
+        <w:t xml:space="preserve"> do </w:t>
+      </w:r>
+      <w:proofErr w:type="spellStart"/>
+      <w:r>
+        <w:t>cadastro</w:t>
+      </w:r>
+      <w:proofErr w:type="spellEnd"/>
+      <w:r>
+        <w:t xml:space="preserve"> e consulta dos </w:t>
+      </w:r>
+      <w:proofErr w:type="spellStart"/>
+      <w:r>
+        <w:t>registros</w:t>
+      </w:r>
+      <w:proofErr w:type="spellEnd"/>
+      <w:r>
+        <w:t>.</w:t>
+      </w:r>
+    </w:p>
+    <w:p>
+      <w:r>
+        <w:t xml:space="preserve">Teste de </w:t>
+      </w:r>
+      <w:proofErr w:type="spellStart"/>
+      <w:r>
+        <w:t>cadastro</w:t>
+      </w:r>
+      <w:proofErr w:type="spellEnd"/>
+      <w:r>
+        <w:t xml:space="preserve"> de </w:t>
+      </w:r>
+      <w:proofErr w:type="spellStart"/>
+      <w:r>
+        <w:t>médicos</w:t>
+      </w:r>
+      <w:proofErr w:type="spellEnd"/>
+    </w:p>
+    <w:p>
+      <w:proofErr w:type="spellStart"/>
+      <w:r>
+        <w:t>Foram</w:t>
+      </w:r>
+      <w:proofErr w:type="spellEnd"/>
+      <w:r>
+        <w:t xml:space="preserve"> </w:t>
+      </w:r>
+      <w:proofErr w:type="spellStart"/>
+      <w:r>
+        <w:t>realizados</w:t>
+      </w:r>
+      <w:proofErr w:type="spellEnd"/>
+      <w:r>
+        <w:t xml:space="preserve"> testes de </w:t>
+      </w:r>
+      <w:proofErr w:type="spellStart"/>
+      <w:r>
+        <w:t>cadastro</w:t>
+      </w:r>
+      <w:proofErr w:type="spellEnd"/>
+      <w:r>
+        <w:t xml:space="preserve"> de </w:t>
+      </w:r>
+      <w:proofErr w:type="spellStart"/>
+      <w:r>
+        <w:t>médicos</w:t>
+      </w:r>
+      <w:proofErr w:type="spellEnd"/>
+      <w:r>
+        <w:t xml:space="preserve"> </w:t>
+      </w:r>
+      <w:proofErr w:type="spellStart"/>
+      <w:r>
+        <w:t>contendo</w:t>
+      </w:r>
+      <w:proofErr w:type="spellEnd"/>
+      <w:r>
+        <w:t xml:space="preserve"> </w:t>
+      </w:r>
+      <w:proofErr w:type="spellStart"/>
+      <w:r>
+        <w:t>especialidade</w:t>
+      </w:r>
+      <w:proofErr w:type="spellEnd"/>
+      <w:r>
+        <w:t xml:space="preserve"> e </w:t>
+      </w:r>
+      <w:proofErr w:type="spellStart"/>
+      <w:r>
+        <w:t>registro</w:t>
+      </w:r>
+      <w:proofErr w:type="spellEnd"/>
+      <w:r>
+        <w:t xml:space="preserve"> </w:t>
+      </w:r>
+      <w:proofErr w:type="spellStart"/>
+      <w:r>
+        <w:t>profissional</w:t>
+      </w:r>
+      <w:proofErr w:type="spellEnd"/>
+      <w:r>
+        <w:t>.</w:t>
+      </w:r>
+    </w:p>
+    <w:p>
+      <w:r>
+        <w:t xml:space="preserve">Teste de </w:t>
+      </w:r>
+      <w:proofErr w:type="spellStart"/>
+      <w:r>
+        <w:t>cadastro</w:t>
+      </w:r>
+      <w:proofErr w:type="spellEnd"/>
+      <w:r>
+        <w:t xml:space="preserve"> de </w:t>
+      </w:r>
+      <w:proofErr w:type="spellStart"/>
+      <w:r>
+        <w:t>consultas</w:t>
+      </w:r>
+      <w:proofErr w:type="spellEnd"/>
+    </w:p>
+    <w:p>
+      <w:proofErr w:type="spellStart"/>
+      <w:r>
+        <w:t>Foi</w:t>
+      </w:r>
+      <w:proofErr w:type="spellEnd"/>
+      <w:r>
+        <w:t xml:space="preserve"> </w:t>
+      </w:r>
+      <w:proofErr w:type="spellStart"/>
+      <w:r>
+        <w:t>validado</w:t>
+      </w:r>
+      <w:proofErr w:type="spellEnd"/>
+      <w:r>
+        <w:t xml:space="preserve"> o </w:t>
+      </w:r>
+      <w:proofErr w:type="spellStart"/>
+      <w:r>
+        <w:t>relacionamento</w:t>
+      </w:r>
+      <w:proofErr w:type="spellEnd"/>
+      <w:r>
+        <w:t xml:space="preserve"> entre </w:t>
+      </w:r>
+      <w:proofErr w:type="spellStart"/>
+      <w:r>
+        <w:t>pacientes</w:t>
+      </w:r>
+      <w:proofErr w:type="spellEnd"/>
+      <w:r>
+        <w:t xml:space="preserve"> e </w:t>
+      </w:r>
+      <w:proofErr w:type="spellStart"/>
+      <w:r>
+        <w:t>médicos</w:t>
+      </w:r>
+      <w:proofErr w:type="spellEnd"/>
+      <w:r>
+        <w:t xml:space="preserve"> </w:t>
+      </w:r>
+      <w:proofErr w:type="spellStart"/>
+      <w:r>
+        <w:t>através</w:t>
+      </w:r>
+      <w:proofErr w:type="spellEnd"/>
+      <w:r>
+        <w:t xml:space="preserve"> do </w:t>
+      </w:r>
+      <w:proofErr w:type="spellStart"/>
+      <w:r>
+        <w:t>registro</w:t>
+      </w:r>
+      <w:proofErr w:type="spellEnd"/>
+      <w:r>
+        <w:t xml:space="preserve"> de </w:t>
+      </w:r>
+      <w:proofErr w:type="spellStart"/>
+      <w:r>
+        <w:t>consultas</w:t>
+      </w:r>
+      <w:proofErr w:type="spellEnd"/>
+      <w:r>
+        <w:t xml:space="preserve"> </w:t>
+      </w:r>
+      <w:proofErr w:type="spellStart"/>
+      <w:r>
+        <w:t>médicas</w:t>
+      </w:r>
+      <w:proofErr w:type="spellEnd"/>
+      <w:r>
+        <w:t>.</w:t>
+      </w:r>
+    </w:p>
+    <w:p>
+      <w:r>
+        <w:t xml:space="preserve">Teste da </w:t>
+      </w:r>
+      <w:proofErr w:type="spellStart"/>
+      <w:r>
+        <w:t>documentação</w:t>
+      </w:r>
+      <w:proofErr w:type="spellEnd"/>
+      <w:r>
+        <w:t xml:space="preserve"> Swagger</w:t>
+      </w:r>
+    </w:p>
+    <w:p>
+      <w:proofErr w:type="spellStart"/>
+      <w:r>
+        <w:t>Foi</w:t>
+      </w:r>
+      <w:proofErr w:type="spellEnd"/>
+      <w:r>
+        <w:t xml:space="preserve"> </w:t>
+      </w:r>
+      <w:proofErr w:type="spellStart"/>
+      <w:r>
+        <w:t>verificado</w:t>
+      </w:r>
+      <w:proofErr w:type="spellEnd"/>
+      <w:r>
+        <w:t xml:space="preserve"> o </w:t>
+      </w:r>
+      <w:proofErr w:type="spellStart"/>
+      <w:r>
+        <w:t>funcionamento</w:t>
+      </w:r>
+      <w:proofErr w:type="spellEnd"/>
+      <w:r>
+        <w:t xml:space="preserve"> </w:t>
+      </w:r>
+      <w:proofErr w:type="spellStart"/>
+      <w:r>
+        <w:t>correto</w:t>
+      </w:r>
+      <w:proofErr w:type="spellEnd"/>
+      <w:r>
+        <w:t xml:space="preserve"> da </w:t>
+      </w:r>
+      <w:proofErr w:type="spellStart"/>
+      <w:r>
+        <w:t>documentação</w:t>
+      </w:r>
+      <w:proofErr w:type="spellEnd"/>
+      <w:r>
+        <w:t xml:space="preserve"> </w:t>
+      </w:r>
+      <w:proofErr w:type="spellStart"/>
+      <w:r>
+        <w:t>automática</w:t>
+      </w:r>
+      <w:proofErr w:type="spellEnd"/>
+      <w:r>
+        <w:t xml:space="preserve"> da API </w:t>
+      </w:r>
+      <w:proofErr w:type="spellStart"/>
+      <w:r>
+        <w:t>utilizando</w:t>
+      </w:r>
+      <w:proofErr w:type="spellEnd"/>
+      <w:r>
+        <w:t xml:space="preserve"> Swagger/</w:t>
+      </w:r>
+      <w:proofErr w:type="spellStart"/>
+      <w:r>
+        <w:t>OpenAPI</w:t>
+      </w:r>
+      <w:proofErr w:type="spellEnd"/>
+      <w:r>
+        <w:t>.</w:t>
+      </w:r>
+    </w:p>
+    <w:p>
+      <w:r>
+        <w:t xml:space="preserve">Teste de </w:t>
+      </w:r>
+      <w:proofErr w:type="spellStart"/>
+      <w:r>
+        <w:t>execução</w:t>
+      </w:r>
+      <w:proofErr w:type="spellEnd"/>
+      <w:r>
+        <w:t xml:space="preserve"> com Docker</w:t>
+      </w:r>
+    </w:p>
+    <w:p>
+      <w:proofErr w:type="gramStart"/>
+      <w:r>
+        <w:t>A</w:t>
+      </w:r>
+      <w:proofErr w:type="gramEnd"/>
+      <w:r>
+        <w:t xml:space="preserve"> </w:t>
+      </w:r>
+      <w:proofErr w:type="spellStart"/>
+      <w:r>
+        <w:t>aplicação</w:t>
+      </w:r>
+      <w:proofErr w:type="spellEnd"/>
+      <w:r>
+        <w:t xml:space="preserve"> </w:t>
+      </w:r>
+      <w:proofErr w:type="spellStart"/>
+      <w:r>
+        <w:t>foi</w:t>
+      </w:r>
+      <w:proofErr w:type="spellEnd"/>
+      <w:r>
+        <w:t xml:space="preserve"> </w:t>
+      </w:r>
+      <w:proofErr w:type="spellStart"/>
+      <w:r>
+        <w:t>executada</w:t>
+      </w:r>
+      <w:proofErr w:type="spellEnd"/>
+      <w:r>
+        <w:t xml:space="preserve"> </w:t>
+      </w:r>
+      <w:proofErr w:type="spellStart"/>
+      <w:r>
+        <w:t>utilizando</w:t>
+      </w:r>
+      <w:proofErr w:type="spellEnd"/>
+      <w:r>
+        <w:t xml:space="preserve"> Docker Compose para </w:t>
+      </w:r>
+      <w:proofErr w:type="spellStart"/>
+      <w:r>
+        <w:t>validação</w:t>
+      </w:r>
+      <w:proofErr w:type="spellEnd"/>
+      <w:r>
+        <w:t xml:space="preserve"> da </w:t>
+      </w:r>
+      <w:proofErr w:type="spellStart"/>
+      <w:r>
+        <w:t>containerização</w:t>
+      </w:r>
+      <w:proofErr w:type="spellEnd"/>
+      <w:r>
+        <w:t xml:space="preserve"> do </w:t>
+      </w:r>
+      <w:proofErr w:type="spellStart"/>
+      <w:r>
+        <w:t>sistema</w:t>
+      </w:r>
+      <w:proofErr w:type="spellEnd"/>
+      <w:r>
+        <w:t>.</w:t>
+      </w:r>
+    </w:p>
+    <w:p>
+      <w:proofErr w:type="spellStart"/>
+      <w:r>
+        <w:t>Os</w:t>
+      </w:r>
+      <w:proofErr w:type="spellEnd"/>
+      <w:r>
+        <w:t xml:space="preserve"> testes </w:t>
+      </w:r>
+      <w:proofErr w:type="spellStart"/>
+      <w:r>
+        <w:t>realizados</w:t>
+      </w:r>
+      <w:proofErr w:type="spellEnd"/>
+      <w:r>
+        <w:t xml:space="preserve"> </w:t>
+      </w:r>
+      <w:proofErr w:type="spellStart"/>
+      <w:r>
+        <w:t>demonstraram</w:t>
+      </w:r>
+      <w:proofErr w:type="spellEnd"/>
+      <w:r>
+        <w:t xml:space="preserve"> o </w:t>
+      </w:r>
+      <w:proofErr w:type="spellStart"/>
+      <w:r>
+        <w:t>correto</w:t>
+      </w:r>
+      <w:proofErr w:type="spellEnd"/>
+      <w:r>
+        <w:t xml:space="preserve"> </w:t>
+      </w:r>
+      <w:proofErr w:type="spellStart"/>
+      <w:r>
+        <w:t>funcionamento</w:t>
+      </w:r>
+      <w:proofErr w:type="spellEnd"/>
+      <w:r>
+        <w:t xml:space="preserve"> das </w:t>
+      </w:r>
+      <w:proofErr w:type="spellStart"/>
+      <w:r>
+        <w:t>funcionalidades</w:t>
+      </w:r>
+      <w:proofErr w:type="spellEnd"/>
+      <w:r>
+        <w:t xml:space="preserve"> </w:t>
+      </w:r>
+      <w:proofErr w:type="spellStart"/>
+      <w:r>
+        <w:t>implementadas</w:t>
+      </w:r>
+      <w:proofErr w:type="spellEnd"/>
+      <w:r>
+        <w:t xml:space="preserve"> </w:t>
+      </w:r>
+      <w:proofErr w:type="spellStart"/>
+      <w:r>
+        <w:t>durante</w:t>
+      </w:r>
+      <w:proofErr w:type="spellEnd"/>
+      <w:r>
+        <w:t xml:space="preserve"> o </w:t>
+      </w:r>
+      <w:proofErr w:type="spellStart"/>
+      <w:r>
+        <w:t>desenvolvimento</w:t>
+      </w:r>
+      <w:proofErr w:type="spellEnd"/>
+      <w:r>
+        <w:t xml:space="preserve"> do </w:t>
+      </w:r>
+      <w:proofErr w:type="spellStart"/>
+      <w:r>
+        <w:t>projeto</w:t>
+      </w:r>
+      <w:proofErr w:type="spellEnd"/>
+      <w:r>
+        <w:t>.</w:t>
+      </w:r>
+    </w:p>
+    <w:p>
+      <w:pPr>
+        <w:rPr>
+          <w:rFonts w:ascii="Arial" w:eastAsiaTheme="majorEastAsia" w:hAnsi="Arial" w:cs="Arial"/>
+          <w:b/>
+          <w:bCs/>
+          <w:sz w:val="32"/>
+          <w:szCs w:val="32"/>
+        </w:rPr>
+      </w:pPr>
+      <w:r>
+        <w:rPr>
+          <w:rFonts w:ascii="Arial" w:eastAsiaTheme="majorEastAsia" w:hAnsi="Arial" w:cs="Arial"/>
+          <w:b/>
+          <w:bCs/>
+          <w:sz w:val="32"/>
+          <w:szCs w:val="32"/>
+        </w:rPr>
+        <w:t xml:space="preserve">10. </w:t>
+      </w:r>
+      <w:proofErr w:type="spellStart"/>
+      <w:r>
+        <w:rPr>
+          <w:rFonts w:ascii="Arial" w:eastAsiaTheme="majorEastAsia" w:hAnsi="Arial" w:cs="Arial"/>
+          <w:b/>
+          <w:bCs/>
+          <w:sz w:val="32"/>
+          <w:szCs w:val="32"/>
+        </w:rPr>
+        <w:t>Conclusão</w:t>
+      </w:r>
+      <w:proofErr w:type="spellEnd"/>
+    </w:p>
+    <w:p>
+      <w:r>
+        <w:t xml:space="preserve">O </w:t>
+      </w:r>
+      <w:proofErr w:type="spellStart"/>
+      <w:r>
+        <w:t>desenvolvimento</w:t>
+      </w:r>
+      <w:proofErr w:type="spellEnd"/>
+      <w:r>
+        <w:t xml:space="preserve"> do </w:t>
+      </w:r>
+      <w:proofErr w:type="spellStart"/>
+      <w:r>
+        <w:t>sistema</w:t>
+      </w:r>
+      <w:proofErr w:type="spellEnd"/>
+      <w:r>
+        <w:t xml:space="preserve"> SGHSS </w:t>
+      </w:r>
+      <w:proofErr w:type="spellStart"/>
+      <w:r>
+        <w:t>permitiu</w:t>
+      </w:r>
+      <w:proofErr w:type="spellEnd"/>
+      <w:r>
+        <w:t xml:space="preserve"> </w:t>
+      </w:r>
+      <w:proofErr w:type="spellStart"/>
+      <w:r>
+        <w:t>aplicar</w:t>
+      </w:r>
+      <w:proofErr w:type="spellEnd"/>
+      <w:r>
+        <w:t xml:space="preserve"> </w:t>
+      </w:r>
+      <w:proofErr w:type="spellStart"/>
+      <w:r>
+        <w:t>na</w:t>
+      </w:r>
+      <w:proofErr w:type="spellEnd"/>
+      <w:r>
+        <w:t xml:space="preserve"> </w:t>
+      </w:r>
+      <w:proofErr w:type="spellStart"/>
+      <w:r>
+        <w:t>prática</w:t>
+      </w:r>
+      <w:proofErr w:type="spellEnd"/>
+      <w:r>
+        <w:t xml:space="preserve"> </w:t>
+      </w:r>
+      <w:proofErr w:type="spellStart"/>
+      <w:r>
+        <w:t>diversos</w:t>
+      </w:r>
+      <w:proofErr w:type="spellEnd"/>
+      <w:r>
+        <w:t xml:space="preserve"> </w:t>
+      </w:r>
+      <w:proofErr w:type="spellStart"/>
+      <w:r>
+        <w:t>conceitos</w:t>
+      </w:r>
+      <w:proofErr w:type="spellEnd"/>
+      <w:r>
+        <w:t xml:space="preserve"> </w:t>
+      </w:r>
+      <w:proofErr w:type="spellStart"/>
+      <w:r>
+        <w:t>importantes</w:t>
+      </w:r>
+      <w:proofErr w:type="spellEnd"/>
+      <w:r>
+        <w:t xml:space="preserve"> </w:t>
+      </w:r>
+      <w:proofErr w:type="spellStart"/>
+      <w:r>
+        <w:t>relacionados</w:t>
+      </w:r>
+      <w:proofErr w:type="spellEnd"/>
+      <w:r>
+        <w:t xml:space="preserve"> </w:t>
+      </w:r>
+      <w:proofErr w:type="spellStart"/>
+      <w:r>
+        <w:t>ao</w:t>
+      </w:r>
+      <w:proofErr w:type="spellEnd"/>
+      <w:r>
+        <w:t xml:space="preserve"> </w:t>
+      </w:r>
+      <w:proofErr w:type="spellStart"/>
+      <w:r>
+        <w:t>desenvolvimento</w:t>
+      </w:r>
+      <w:proofErr w:type="spellEnd"/>
+      <w:r>
+        <w:t xml:space="preserve"> Back-end com Java e Spring Boot.</w:t>
+      </w:r>
+    </w:p>
+    <w:p>
+      <w:r>
+        <w:t xml:space="preserve">Durante o </w:t>
+      </w:r>
+      <w:proofErr w:type="spellStart"/>
+      <w:r>
+        <w:t>projeto</w:t>
+      </w:r>
+      <w:proofErr w:type="spellEnd"/>
+      <w:r>
+        <w:t xml:space="preserve"> </w:t>
+      </w:r>
+      <w:proofErr w:type="spellStart"/>
+      <w:r>
+        <w:t>foram</w:t>
+      </w:r>
+      <w:proofErr w:type="spellEnd"/>
+      <w:r>
+        <w:t xml:space="preserve"> </w:t>
+      </w:r>
+      <w:proofErr w:type="spellStart"/>
+      <w:r>
+        <w:t>utilizados</w:t>
+      </w:r>
+      <w:proofErr w:type="spellEnd"/>
+      <w:r>
+        <w:t xml:space="preserve"> </w:t>
+      </w:r>
+      <w:proofErr w:type="spellStart"/>
+      <w:r>
+        <w:t>conceitos</w:t>
+      </w:r>
+      <w:proofErr w:type="spellEnd"/>
+      <w:r>
+        <w:t xml:space="preserve"> de </w:t>
+      </w:r>
+      <w:proofErr w:type="spellStart"/>
+      <w:r>
+        <w:t>arquitetura</w:t>
+      </w:r>
+      <w:proofErr w:type="spellEnd"/>
+      <w:r>
+        <w:t xml:space="preserve"> </w:t>
+      </w:r>
+      <w:proofErr w:type="spellStart"/>
+      <w:r>
+        <w:t>em</w:t>
+      </w:r>
+      <w:proofErr w:type="spellEnd"/>
+      <w:r>
+        <w:t xml:space="preserve"> </w:t>
+      </w:r>
+      <w:proofErr w:type="spellStart"/>
+      <w:r>
+        <w:t>camadas</w:t>
+      </w:r>
+      <w:proofErr w:type="spellEnd"/>
+      <w:r>
+        <w:t xml:space="preserve">, </w:t>
+      </w:r>
+      <w:proofErr w:type="spellStart"/>
+      <w:r>
+        <w:t>criação</w:t>
+      </w:r>
+      <w:proofErr w:type="spellEnd"/>
+      <w:r>
+        <w:t xml:space="preserve"> de APIs REST, </w:t>
+      </w:r>
+      <w:proofErr w:type="spellStart"/>
+      <w:r>
+        <w:t>persistência</w:t>
+      </w:r>
+      <w:proofErr w:type="spellEnd"/>
+      <w:r>
+        <w:t xml:space="preserve"> de dados com JPA/Hibernate, </w:t>
+      </w:r>
+      <w:proofErr w:type="spellStart"/>
+      <w:r>
+        <w:t>autenticação</w:t>
+      </w:r>
+      <w:proofErr w:type="spellEnd"/>
+      <w:r>
+        <w:t xml:space="preserve"> </w:t>
+      </w:r>
+      <w:proofErr w:type="spellStart"/>
+      <w:r>
+        <w:t>utilizando</w:t>
+      </w:r>
+      <w:proofErr w:type="spellEnd"/>
+      <w:r>
+        <w:t xml:space="preserve"> JWT e </w:t>
+      </w:r>
+      <w:proofErr w:type="spellStart"/>
+      <w:r>
+        <w:t>documentação</w:t>
+      </w:r>
+      <w:proofErr w:type="spellEnd"/>
+      <w:r>
+        <w:t xml:space="preserve"> </w:t>
+      </w:r>
+      <w:proofErr w:type="spellStart"/>
+      <w:r>
+        <w:t>automática</w:t>
+      </w:r>
+      <w:proofErr w:type="spellEnd"/>
+      <w:r>
+        <w:t xml:space="preserve"> com Swagger/</w:t>
+      </w:r>
+      <w:proofErr w:type="spellStart"/>
+      <w:r>
+        <w:t>OpenAPI</w:t>
+      </w:r>
+      <w:proofErr w:type="spellEnd"/>
+      <w:r>
+        <w:t>.</w:t>
+      </w:r>
+    </w:p>
+    <w:p>
+      <w:proofErr w:type="spellStart"/>
+      <w:r>
+        <w:t>Além</w:t>
+      </w:r>
+      <w:proofErr w:type="spellEnd"/>
+      <w:r>
+        <w:t xml:space="preserve"> </w:t>
+      </w:r>
+      <w:proofErr w:type="spellStart"/>
+      <w:r>
+        <w:t>disso</w:t>
+      </w:r>
+      <w:proofErr w:type="spellEnd"/>
+      <w:r>
+        <w:t xml:space="preserve">, a </w:t>
+      </w:r>
+      <w:proofErr w:type="spellStart"/>
+      <w:r>
+        <w:t>utilização</w:t>
+      </w:r>
+      <w:proofErr w:type="spellEnd"/>
+      <w:r>
+        <w:t xml:space="preserve"> do Docker </w:t>
+      </w:r>
+      <w:proofErr w:type="spellStart"/>
+      <w:r>
+        <w:t>proporcionou</w:t>
+      </w:r>
+      <w:proofErr w:type="spellEnd"/>
+      <w:r>
+        <w:t xml:space="preserve"> </w:t>
+      </w:r>
+      <w:proofErr w:type="spellStart"/>
+      <w:r>
+        <w:t>maior</w:t>
+      </w:r>
+      <w:proofErr w:type="spellEnd"/>
+      <w:r>
+        <w:t xml:space="preserve"> </w:t>
+      </w:r>
+      <w:proofErr w:type="spellStart"/>
+      <w:r>
+        <w:t>portabilidade</w:t>
+      </w:r>
+      <w:proofErr w:type="spellEnd"/>
+      <w:r>
+        <w:t xml:space="preserve"> para </w:t>
+      </w:r>
+      <w:proofErr w:type="spellStart"/>
+      <w:r>
+        <w:t>execução</w:t>
+      </w:r>
+      <w:proofErr w:type="spellEnd"/>
+      <w:r>
+        <w:t xml:space="preserve"> da </w:t>
+      </w:r>
+      <w:proofErr w:type="spellStart"/>
+      <w:r>
+        <w:t>aplicação</w:t>
+      </w:r>
+      <w:proofErr w:type="spellEnd"/>
+      <w:r>
+        <w:t xml:space="preserve">, </w:t>
+      </w:r>
+      <w:proofErr w:type="spellStart"/>
+      <w:r>
+        <w:t>aproximando</w:t>
+      </w:r>
+      <w:proofErr w:type="spellEnd"/>
+      <w:r>
+        <w:t xml:space="preserve"> o </w:t>
+      </w:r>
+      <w:proofErr w:type="spellStart"/>
+      <w:r>
+        <w:t>projeto</w:t>
+      </w:r>
+      <w:proofErr w:type="spellEnd"/>
+      <w:r>
+        <w:t xml:space="preserve"> de </w:t>
+      </w:r>
+      <w:proofErr w:type="spellStart"/>
+      <w:r>
+        <w:t>práticas</w:t>
+      </w:r>
+      <w:proofErr w:type="spellEnd"/>
+      <w:r>
+        <w:t xml:space="preserve"> </w:t>
+      </w:r>
+      <w:proofErr w:type="spellStart"/>
+      <w:r>
+        <w:t>utilizadas</w:t>
+      </w:r>
+      <w:proofErr w:type="spellEnd"/>
+      <w:r>
+        <w:t xml:space="preserve"> no mercado </w:t>
+      </w:r>
+      <w:proofErr w:type="spellStart"/>
+      <w:r>
+        <w:t>profissional</w:t>
+      </w:r>
+      <w:proofErr w:type="spellEnd"/>
+      <w:r>
+        <w:t>.</w:t>
+      </w:r>
+    </w:p>
+    <w:p>
+      <w:r>
+        <w:lastRenderedPageBreak/>
+        <w:t xml:space="preserve">O </w:t>
+      </w:r>
+      <w:proofErr w:type="spellStart"/>
+      <w:r>
+        <w:t>sistema</w:t>
+      </w:r>
+      <w:proofErr w:type="spellEnd"/>
+      <w:r>
+        <w:t xml:space="preserve"> </w:t>
+      </w:r>
+      <w:proofErr w:type="spellStart"/>
+      <w:r>
+        <w:t>desenvolvido</w:t>
+      </w:r>
+      <w:proofErr w:type="spellEnd"/>
+      <w:r>
+        <w:t xml:space="preserve"> </w:t>
+      </w:r>
+      <w:proofErr w:type="spellStart"/>
+      <w:r>
+        <w:t>atingiu</w:t>
+      </w:r>
+      <w:proofErr w:type="spellEnd"/>
+      <w:r>
+        <w:t xml:space="preserve"> </w:t>
+      </w:r>
+      <w:proofErr w:type="spellStart"/>
+      <w:r>
+        <w:t>os</w:t>
+      </w:r>
+      <w:proofErr w:type="spellEnd"/>
+      <w:r>
+        <w:t xml:space="preserve"> </w:t>
+      </w:r>
+      <w:proofErr w:type="spellStart"/>
+      <w:r>
+        <w:t>objetivos</w:t>
+      </w:r>
+      <w:proofErr w:type="spellEnd"/>
+      <w:r>
+        <w:t xml:space="preserve"> </w:t>
+      </w:r>
+      <w:proofErr w:type="spellStart"/>
+      <w:r>
+        <w:t>propostos</w:t>
+      </w:r>
+      <w:proofErr w:type="spellEnd"/>
+      <w:r>
+        <w:t xml:space="preserve">, </w:t>
+      </w:r>
+      <w:proofErr w:type="spellStart"/>
+      <w:r>
+        <w:t>permitindo</w:t>
+      </w:r>
+      <w:proofErr w:type="spellEnd"/>
+      <w:r>
+        <w:t xml:space="preserve"> o </w:t>
+      </w:r>
+      <w:proofErr w:type="spellStart"/>
+      <w:r>
+        <w:t>gerenciamento</w:t>
+      </w:r>
+      <w:proofErr w:type="spellEnd"/>
+      <w:r>
+        <w:t xml:space="preserve"> de </w:t>
+      </w:r>
+      <w:proofErr w:type="spellStart"/>
+      <w:r>
+        <w:t>usuários</w:t>
+      </w:r>
+      <w:proofErr w:type="spellEnd"/>
+      <w:r>
+        <w:t xml:space="preserve">, </w:t>
+      </w:r>
+      <w:proofErr w:type="spellStart"/>
+      <w:r>
+        <w:t>pacientes</w:t>
+      </w:r>
+      <w:proofErr w:type="spellEnd"/>
+      <w:r>
+        <w:t xml:space="preserve">, </w:t>
+      </w:r>
+      <w:proofErr w:type="spellStart"/>
+      <w:r>
+        <w:t>médicos</w:t>
+      </w:r>
+      <w:proofErr w:type="spellEnd"/>
+      <w:r>
+        <w:t xml:space="preserve"> e </w:t>
+      </w:r>
+      <w:proofErr w:type="spellStart"/>
+      <w:r>
+        <w:t>consultas</w:t>
+      </w:r>
+      <w:proofErr w:type="spellEnd"/>
+      <w:r>
+        <w:t xml:space="preserve"> </w:t>
+      </w:r>
+      <w:proofErr w:type="spellStart"/>
+      <w:r>
+        <w:t>médicas</w:t>
+      </w:r>
+      <w:proofErr w:type="spellEnd"/>
+      <w:r>
+        <w:t xml:space="preserve"> </w:t>
+      </w:r>
+      <w:proofErr w:type="spellStart"/>
+      <w:r>
+        <w:t>através</w:t>
+      </w:r>
+      <w:proofErr w:type="spellEnd"/>
+      <w:r>
+        <w:t xml:space="preserve"> de </w:t>
+      </w:r>
+      <w:proofErr w:type="spellStart"/>
+      <w:r>
+        <w:t>uma</w:t>
+      </w:r>
+      <w:proofErr w:type="spellEnd"/>
+      <w:r>
+        <w:t xml:space="preserve"> API </w:t>
+      </w:r>
+      <w:proofErr w:type="spellStart"/>
+      <w:r>
+        <w:t>funcional</w:t>
+      </w:r>
+      <w:proofErr w:type="spellEnd"/>
+      <w:r>
+        <w:t xml:space="preserve"> e </w:t>
+      </w:r>
+      <w:proofErr w:type="spellStart"/>
+      <w:r>
+        <w:t>organizada</w:t>
+      </w:r>
+      <w:proofErr w:type="spellEnd"/>
+      <w:r>
+        <w:t>.</w:t>
+      </w:r>
+    </w:p>
+    <w:p>
+      <w:r>
+        <w:t xml:space="preserve">O </w:t>
+      </w:r>
+      <w:proofErr w:type="spellStart"/>
+      <w:r>
+        <w:t>projeto</w:t>
+      </w:r>
+      <w:proofErr w:type="spellEnd"/>
+      <w:r>
+        <w:t xml:space="preserve"> </w:t>
+      </w:r>
+      <w:proofErr w:type="spellStart"/>
+      <w:r>
+        <w:t>também</w:t>
+      </w:r>
+      <w:proofErr w:type="spellEnd"/>
+      <w:r>
+        <w:t xml:space="preserve"> </w:t>
+      </w:r>
+      <w:proofErr w:type="spellStart"/>
+      <w:r>
+        <w:t>contribuiu</w:t>
+      </w:r>
+      <w:proofErr w:type="spellEnd"/>
+      <w:r>
+        <w:t xml:space="preserve"> </w:t>
+      </w:r>
+      <w:proofErr w:type="spellStart"/>
+      <w:r>
+        <w:t>significativamente</w:t>
+      </w:r>
+      <w:proofErr w:type="spellEnd"/>
+      <w:r>
+        <w:t xml:space="preserve"> para </w:t>
+      </w:r>
+      <w:proofErr w:type="spellStart"/>
+      <w:r>
+        <w:t>evolução</w:t>
+      </w:r>
+      <w:proofErr w:type="spellEnd"/>
+      <w:r>
+        <w:t xml:space="preserve"> </w:t>
+      </w:r>
+      <w:proofErr w:type="spellStart"/>
+      <w:r>
+        <w:t>prática</w:t>
+      </w:r>
+      <w:proofErr w:type="spellEnd"/>
+      <w:r>
+        <w:t xml:space="preserve"> </w:t>
+      </w:r>
+      <w:proofErr w:type="spellStart"/>
+      <w:r>
+        <w:t>em</w:t>
+      </w:r>
+      <w:proofErr w:type="spellEnd"/>
+      <w:r>
+        <w:t xml:space="preserve"> </w:t>
+      </w:r>
+      <w:proofErr w:type="spellStart"/>
+      <w:r>
+        <w:t>tecnologias</w:t>
+      </w:r>
+      <w:proofErr w:type="spellEnd"/>
+      <w:r>
+        <w:t xml:space="preserve"> Back-end, </w:t>
+      </w:r>
+      <w:proofErr w:type="spellStart"/>
+      <w:r>
+        <w:t>integração</w:t>
+      </w:r>
+      <w:proofErr w:type="spellEnd"/>
+      <w:r>
+        <w:t xml:space="preserve"> com banco de dados, </w:t>
+      </w:r>
+      <w:proofErr w:type="spellStart"/>
+      <w:r>
+        <w:t>segurança</w:t>
+      </w:r>
+      <w:proofErr w:type="spellEnd"/>
+      <w:r>
+        <w:t xml:space="preserve"> de </w:t>
+      </w:r>
+      <w:proofErr w:type="spellStart"/>
+      <w:r>
+        <w:t>autenticação</w:t>
+      </w:r>
+      <w:proofErr w:type="spellEnd"/>
+      <w:r>
+        <w:t xml:space="preserve"> e </w:t>
+      </w:r>
+      <w:proofErr w:type="spellStart"/>
+      <w:r>
+        <w:t>organização</w:t>
+      </w:r>
+      <w:proofErr w:type="spellEnd"/>
+      <w:r>
+        <w:t xml:space="preserve"> </w:t>
+      </w:r>
+      <w:proofErr w:type="spellStart"/>
+      <w:r>
+        <w:t>estrutural</w:t>
+      </w:r>
+      <w:proofErr w:type="spellEnd"/>
+      <w:r>
+        <w:t xml:space="preserve"> de </w:t>
+      </w:r>
+      <w:proofErr w:type="spellStart"/>
+      <w:r>
+        <w:t>aplicações</w:t>
+      </w:r>
+      <w:proofErr w:type="spellEnd"/>
+      <w:r>
+        <w:t xml:space="preserve"> Java.</w:t>
+      </w:r>
+    </w:p>
+    <w:p>
+      <w:proofErr w:type="gramStart"/>
+      <w:r>
+        <w:t>A</w:t>
+      </w:r>
+      <w:proofErr w:type="gramEnd"/>
+      <w:r>
+        <w:t xml:space="preserve"> </w:t>
+      </w:r>
+      <w:proofErr w:type="spellStart"/>
+      <w:r>
+        <w:t>experiência</w:t>
+      </w:r>
+      <w:proofErr w:type="spellEnd"/>
+      <w:r>
+        <w:t xml:space="preserve"> </w:t>
+      </w:r>
+      <w:proofErr w:type="spellStart"/>
+      <w:r>
+        <w:t>adquirida</w:t>
+      </w:r>
+      <w:proofErr w:type="spellEnd"/>
+      <w:r>
+        <w:t xml:space="preserve"> </w:t>
+      </w:r>
+      <w:proofErr w:type="spellStart"/>
+      <w:r>
+        <w:t>durante</w:t>
+      </w:r>
+      <w:proofErr w:type="spellEnd"/>
+      <w:r>
+        <w:t xml:space="preserve"> o </w:t>
+      </w:r>
+      <w:proofErr w:type="spellStart"/>
+      <w:r>
+        <w:t>desenvolvimento</w:t>
+      </w:r>
+      <w:proofErr w:type="spellEnd"/>
+      <w:r>
+        <w:t xml:space="preserve"> do SGHSS </w:t>
+      </w:r>
+      <w:proofErr w:type="spellStart"/>
+      <w:r>
+        <w:t>fortaleceu</w:t>
+      </w:r>
+      <w:proofErr w:type="spellEnd"/>
+      <w:r>
+        <w:t xml:space="preserve"> </w:t>
+      </w:r>
+      <w:proofErr w:type="spellStart"/>
+      <w:r>
+        <w:t>conhecimentos</w:t>
+      </w:r>
+      <w:proofErr w:type="spellEnd"/>
+      <w:r>
+        <w:t xml:space="preserve"> </w:t>
+      </w:r>
+      <w:proofErr w:type="spellStart"/>
+      <w:r>
+        <w:t>importantes</w:t>
+      </w:r>
+      <w:proofErr w:type="spellEnd"/>
+      <w:r>
+        <w:t xml:space="preserve"> para </w:t>
+      </w:r>
+      <w:proofErr w:type="spellStart"/>
+      <w:r>
+        <w:t>continuidade</w:t>
+      </w:r>
+      <w:proofErr w:type="spellEnd"/>
+      <w:r>
+        <w:t xml:space="preserve"> dos </w:t>
+      </w:r>
+      <w:proofErr w:type="spellStart"/>
+      <w:r>
+        <w:t>estudos</w:t>
+      </w:r>
+      <w:proofErr w:type="spellEnd"/>
+      <w:r>
+        <w:t xml:space="preserve"> e </w:t>
+      </w:r>
+      <w:proofErr w:type="spellStart"/>
+      <w:r>
+        <w:t>evolução</w:t>
+      </w:r>
+      <w:proofErr w:type="spellEnd"/>
+      <w:r>
+        <w:t xml:space="preserve"> </w:t>
+      </w:r>
+      <w:proofErr w:type="spellStart"/>
+      <w:r>
+        <w:t>profissional</w:t>
+      </w:r>
+      <w:proofErr w:type="spellEnd"/>
+      <w:r>
+        <w:t xml:space="preserve"> </w:t>
+      </w:r>
+      <w:proofErr w:type="spellStart"/>
+      <w:r>
+        <w:t>na</w:t>
+      </w:r>
+      <w:proofErr w:type="spellEnd"/>
+      <w:r>
+        <w:t xml:space="preserve"> </w:t>
+      </w:r>
+      <w:proofErr w:type="spellStart"/>
+      <w:r>
+        <w:t>área</w:t>
+      </w:r>
+      <w:proofErr w:type="spellEnd"/>
+      <w:r>
+        <w:t xml:space="preserve"> de </w:t>
+      </w:r>
+      <w:proofErr w:type="spellStart"/>
+      <w:r>
+        <w:t>desenvolvimento</w:t>
+      </w:r>
+      <w:proofErr w:type="spellEnd"/>
+      <w:r>
+        <w:t xml:space="preserve"> de software.</w:t>
+      </w:r>
+    </w:p>
+    <w:p>
+      <w:pPr>
+        <w:pStyle w:val="Ttulo1"/>
+        <w:spacing w:line="360" w:lineRule="auto"/>
+        <w:jc w:val="both"/>
         <w:rPr>
           <w:rFonts w:ascii="Arial" w:hAnsi="Arial" w:cs="Arial"/>
           <w:b/>
@@ -1173,9 +5359,444 @@
           <w:color w:val="auto"/>
           <w:lang w:val="pt-BR"/>
         </w:rPr>
-        <w:t>11. Link do GitHub</w:t>
+      </w:pPr>
+      <w:bookmarkStart w:id="9" w:name="_Toc228922819"/>
+      <w:r>
+        <w:rPr>
+          <w:rFonts w:ascii="Arial" w:hAnsi="Arial" w:cs="Arial"/>
+          <w:b/>
+          <w:bCs/>
+          <w:color w:val="auto"/>
+          <w:lang w:val="pt-BR"/>
+        </w:rPr>
+        <w:t>1</w:t>
+      </w:r>
+      <w:r>
+        <w:rPr>
+          <w:rFonts w:ascii="Arial" w:hAnsi="Arial" w:cs="Arial"/>
+          <w:b/>
+          <w:bCs/>
+          <w:color w:val="auto"/>
+          <w:lang w:val="pt-BR"/>
+        </w:rPr>
+        <w:t>1</w:t>
+      </w:r>
+      <w:r>
+        <w:rPr>
+          <w:rFonts w:ascii="Arial" w:hAnsi="Arial" w:cs="Arial"/>
+          <w:b/>
+          <w:bCs/>
+          <w:color w:val="auto"/>
+          <w:lang w:val="pt-BR"/>
+        </w:rPr>
+        <w:t>. Referências</w:t>
+      </w:r>
+      <w:bookmarkEnd w:id="9"/>
+    </w:p>
+    <w:p>
+      <w:pPr>
+        <w:rPr>
+          <w:lang w:val="pt-BR"/>
+        </w:rPr>
+      </w:pPr>
+      <w:r>
+        <w:rPr>
+          <w:lang w:val="pt-BR"/>
+        </w:rPr>
+        <w:t xml:space="preserve">SPRING. Spring Boot </w:t>
+      </w:r>
+      <w:proofErr w:type="spellStart"/>
+      <w:r>
+        <w:rPr>
+          <w:lang w:val="pt-BR"/>
+        </w:rPr>
+        <w:t>Documentation</w:t>
+      </w:r>
+      <w:proofErr w:type="spellEnd"/>
+      <w:r>
+        <w:rPr>
+          <w:lang w:val="pt-BR"/>
+        </w:rPr>
+        <w:t>. Disponível em:</w:t>
+      </w:r>
+    </w:p>
+    <w:p>
+      <w:pPr>
+        <w:rPr>
+          <w:lang w:val="pt-BR"/>
+        </w:rPr>
+      </w:pPr>
+      <w:r>
+        <w:rPr>
+          <w:lang w:val="pt-BR"/>
+        </w:rPr>
+        <w:t>https://spring.io/projects/spring-boot</w:t>
+      </w:r>
+    </w:p>
+    <w:p>
+      <w:pPr>
+        <w:rPr>
+          <w:lang w:val="pt-BR"/>
+        </w:rPr>
+      </w:pPr>
+      <w:r>
+        <w:rPr>
+          <w:lang w:val="pt-BR"/>
+        </w:rPr>
+        <w:t>Acesso em: 06 maio 2026.</w:t>
+      </w:r>
+    </w:p>
+    <w:p>
+      <w:pPr>
+        <w:rPr>
+          <w:lang w:val="pt-BR"/>
+        </w:rPr>
+      </w:pPr>
+      <w:r>
+        <w:rPr>
+          <w:lang w:val="pt-BR"/>
+        </w:rPr>
+        <w:t xml:space="preserve">SPRING. Spring Security </w:t>
+      </w:r>
+      <w:proofErr w:type="spellStart"/>
+      <w:r>
+        <w:rPr>
+          <w:lang w:val="pt-BR"/>
+        </w:rPr>
+        <w:t>Documentation</w:t>
+      </w:r>
+      <w:proofErr w:type="spellEnd"/>
+      <w:r>
+        <w:rPr>
+          <w:lang w:val="pt-BR"/>
+        </w:rPr>
+        <w:t>. Disponível em:</w:t>
+      </w:r>
+    </w:p>
+    <w:p>
+      <w:pPr>
+        <w:rPr>
+          <w:lang w:val="pt-BR"/>
+        </w:rPr>
+      </w:pPr>
+      <w:r>
+        <w:rPr>
+          <w:lang w:val="pt-BR"/>
+        </w:rPr>
+        <w:t>https://spring.io/projects/spring-security</w:t>
+      </w:r>
+    </w:p>
+    <w:p>
+      <w:pPr>
+        <w:rPr>
+          <w:lang w:val="pt-BR"/>
+        </w:rPr>
+      </w:pPr>
+      <w:r>
+        <w:rPr>
+          <w:lang w:val="pt-BR"/>
+        </w:rPr>
+        <w:t>Acesso em: 06 maio 2026.</w:t>
+      </w:r>
+    </w:p>
+    <w:p>
+      <w:pPr>
+        <w:rPr>
+          <w:lang w:val="pt-BR"/>
+        </w:rPr>
+      </w:pPr>
+      <w:r>
+        <w:rPr>
+          <w:lang w:val="pt-BR"/>
+        </w:rPr>
+        <w:t>JWT.IO. JSON Web Tokens. Disponível em:</w:t>
+      </w:r>
+    </w:p>
+    <w:p>
+      <w:pPr>
+        <w:rPr>
+          <w:lang w:val="pt-BR"/>
+        </w:rPr>
+      </w:pPr>
+      <w:r>
+        <w:rPr>
+          <w:lang w:val="pt-BR"/>
+        </w:rPr>
+        <w:t>https://jwt.io/</w:t>
+      </w:r>
+    </w:p>
+    <w:p>
+      <w:pPr>
+        <w:rPr>
+          <w:lang w:val="pt-BR"/>
+        </w:rPr>
+      </w:pPr>
+      <w:r>
+        <w:rPr>
+          <w:lang w:val="pt-BR"/>
+        </w:rPr>
+        <w:t>Acesso em: 06 maio 2026.</w:t>
+      </w:r>
+    </w:p>
+    <w:p>
+      <w:pPr>
+        <w:rPr>
+          <w:lang w:val="pt-BR"/>
+        </w:rPr>
+      </w:pPr>
+      <w:r>
+        <w:rPr>
+          <w:lang w:val="pt-BR"/>
+        </w:rPr>
+        <w:t xml:space="preserve">DOCKER. Docker </w:t>
+      </w:r>
+      <w:proofErr w:type="spellStart"/>
+      <w:r>
+        <w:rPr>
+          <w:lang w:val="pt-BR"/>
+        </w:rPr>
+        <w:t>Documentation</w:t>
+      </w:r>
+      <w:proofErr w:type="spellEnd"/>
+      <w:r>
+        <w:rPr>
+          <w:lang w:val="pt-BR"/>
+        </w:rPr>
+        <w:t>. Disponível em:</w:t>
+      </w:r>
+    </w:p>
+    <w:p>
+      <w:pPr>
+        <w:rPr>
+          <w:lang w:val="pt-BR"/>
+        </w:rPr>
+      </w:pPr>
+      <w:r>
+        <w:rPr>
+          <w:lang w:val="pt-BR"/>
+        </w:rPr>
+        <w:t>https://docs.docker.com/</w:t>
+      </w:r>
+    </w:p>
+    <w:p>
+      <w:pPr>
+        <w:rPr>
+          <w:lang w:val="pt-BR"/>
+        </w:rPr>
+      </w:pPr>
+      <w:r>
+        <w:rPr>
+          <w:lang w:val="pt-BR"/>
+        </w:rPr>
+        <w:t>Acesso em: 06 maio 2026.</w:t>
+      </w:r>
+    </w:p>
+    <w:p>
+      <w:pPr>
+        <w:rPr>
+          <w:lang w:val="pt-BR"/>
+        </w:rPr>
+      </w:pPr>
+      <w:r>
+        <w:rPr>
+          <w:lang w:val="pt-BR"/>
+        </w:rPr>
+        <w:t xml:space="preserve">H2 DATABASE. H2 </w:t>
+      </w:r>
+      <w:proofErr w:type="spellStart"/>
+      <w:r>
+        <w:rPr>
+          <w:lang w:val="pt-BR"/>
+        </w:rPr>
+        <w:t>Database</w:t>
+      </w:r>
+      <w:proofErr w:type="spellEnd"/>
+      <w:r>
+        <w:rPr>
+          <w:lang w:val="pt-BR"/>
+        </w:rPr>
+        <w:t xml:space="preserve"> </w:t>
+      </w:r>
+      <w:proofErr w:type="spellStart"/>
+      <w:r>
+        <w:rPr>
+          <w:lang w:val="pt-BR"/>
+        </w:rPr>
+        <w:t>Engine</w:t>
+      </w:r>
+      <w:proofErr w:type="spellEnd"/>
+      <w:r>
+        <w:rPr>
+          <w:lang w:val="pt-BR"/>
+        </w:rPr>
+        <w:t>. Disponível em:</w:t>
+      </w:r>
+    </w:p>
+    <w:p>
+      <w:pPr>
+        <w:rPr>
+          <w:lang w:val="pt-BR"/>
+        </w:rPr>
+      </w:pPr>
+      <w:r>
+        <w:rPr>
+          <w:lang w:val="pt-BR"/>
+        </w:rPr>
+        <w:t>https://www.h2database.com/html/main.html</w:t>
+      </w:r>
+    </w:p>
+    <w:p>
+      <w:pPr>
+        <w:rPr>
+          <w:lang w:val="pt-BR"/>
+        </w:rPr>
+      </w:pPr>
+      <w:r>
+        <w:rPr>
+          <w:lang w:val="pt-BR"/>
+        </w:rPr>
+        <w:t>Acesso em: 06 maio 2026.</w:t>
+      </w:r>
+    </w:p>
+    <w:p>
+      <w:pPr>
+        <w:rPr>
+          <w:lang w:val="pt-BR"/>
+        </w:rPr>
+      </w:pPr>
+      <w:r>
+        <w:rPr>
+          <w:lang w:val="pt-BR"/>
+        </w:rPr>
+        <w:t xml:space="preserve">SWAGGER. </w:t>
+      </w:r>
+      <w:proofErr w:type="spellStart"/>
+      <w:r>
+        <w:rPr>
+          <w:lang w:val="pt-BR"/>
+        </w:rPr>
+        <w:t>OpenAPI</w:t>
+      </w:r>
+      <w:proofErr w:type="spellEnd"/>
+      <w:r>
+        <w:rPr>
+          <w:lang w:val="pt-BR"/>
+        </w:rPr>
+        <w:t xml:space="preserve"> </w:t>
+      </w:r>
+      <w:proofErr w:type="spellStart"/>
+      <w:r>
+        <w:rPr>
+          <w:lang w:val="pt-BR"/>
+        </w:rPr>
+        <w:t>Specification</w:t>
+      </w:r>
+      <w:proofErr w:type="spellEnd"/>
+      <w:r>
+        <w:rPr>
+          <w:lang w:val="pt-BR"/>
+        </w:rPr>
+        <w:t>. Disponível em:</w:t>
+      </w:r>
+    </w:p>
+    <w:p>
+      <w:pPr>
+        <w:rPr>
+          <w:lang w:val="pt-BR"/>
+        </w:rPr>
+      </w:pPr>
+      <w:r>
+        <w:rPr>
+          <w:lang w:val="pt-BR"/>
+        </w:rPr>
+        <w:t>https://swagger.io/specification/</w:t>
+      </w:r>
+    </w:p>
+    <w:p>
+      <w:pPr>
+        <w:rPr>
+          <w:lang w:val="pt-BR"/>
+        </w:rPr>
+      </w:pPr>
+      <w:r>
+        <w:rPr>
+          <w:lang w:val="pt-BR"/>
+        </w:rPr>
+        <w:lastRenderedPageBreak/>
+        <w:t>Acesso em: 06 maio 2026.</w:t>
+      </w:r>
+    </w:p>
+    <w:p>
+      <w:pPr>
+        <w:pStyle w:val="Ttulo1"/>
+        <w:spacing w:line="360" w:lineRule="auto"/>
+        <w:jc w:val="both"/>
+        <w:rPr>
+          <w:rFonts w:ascii="Arial" w:hAnsi="Arial" w:cs="Arial"/>
+          <w:b/>
+          <w:bCs/>
+          <w:color w:val="auto"/>
+          <w:lang w:val="pt-BR"/>
+        </w:rPr>
+      </w:pPr>
+      <w:bookmarkStart w:id="10" w:name="_Toc228922820"/>
+      <w:r>
+        <w:rPr>
+          <w:rFonts w:ascii="Arial" w:hAnsi="Arial" w:cs="Arial"/>
+          <w:b/>
+          <w:bCs/>
+          <w:color w:val="auto"/>
+          <w:lang w:val="pt-BR"/>
+        </w:rPr>
+        <w:t>1</w:t>
+      </w:r>
+      <w:r>
+        <w:rPr>
+          <w:rFonts w:ascii="Arial" w:hAnsi="Arial" w:cs="Arial"/>
+          <w:b/>
+          <w:bCs/>
+          <w:color w:val="auto"/>
+          <w:lang w:val="pt-BR"/>
+        </w:rPr>
+        <w:t>2</w:t>
+      </w:r>
+      <w:r>
+        <w:rPr>
+          <w:rFonts w:ascii="Arial" w:hAnsi="Arial" w:cs="Arial"/>
+          <w:b/>
+          <w:bCs/>
+          <w:color w:val="auto"/>
+          <w:lang w:val="pt-BR"/>
+        </w:rPr>
+        <w:t>. Link do GitHub</w:t>
       </w:r>
       <w:bookmarkEnd w:id="10"/>
+    </w:p>
+    <w:p>
+      <w:pPr>
+        <w:rPr>
+          <w:lang w:val="pt-BR"/>
+        </w:rPr>
+      </w:pPr>
+      <w:r>
+        <w:rPr>
+          <w:lang w:val="pt-BR"/>
+        </w:rPr>
+        <w:t>Repositório do projeto:</w:t>
+      </w:r>
+    </w:p>
+    <w:p>
+      <w:pPr>
+        <w:rPr>
+          <w:lang w:val="pt-BR"/>
+        </w:rPr>
+      </w:pPr>
+      <w:r>
+        <w:rPr>
+          <w:lang w:val="pt-BR"/>
+        </w:rPr>
+        <w:t>https://github.com/wedengabriel/sistema-gestao-hospitalar-sghss</w:t>
+      </w:r>
     </w:p>
     <w:sectPr>
       <w:footerReference w:type="default" r:id="rId8"/>
@@ -1798,10 +6419,32 @@
       <w:szCs w:val="32"/>
     </w:rPr>
   </w:style>
+  <w:style w:type="paragraph" w:styleId="Ttulo2">
+    <w:name w:val="heading 2"/>
+    <w:basedOn w:val="Normal"/>
+    <w:next w:val="Normal"/>
+    <w:link w:val="Ttulo2Char"/>
+    <w:uiPriority w:val="9"/>
+    <w:semiHidden/>
+    <w:unhideWhenUsed/>
+    <w:qFormat/>
+    <w:rsid w:val="00AE1044"/>
+    <w:pPr>
+      <w:keepNext/>
+      <w:keepLines/>
+      <w:spacing w:before="40" w:after="0"/>
+      <w:outlineLvl w:val="1"/>
+    </w:pPr>
+    <w:rPr>
+      <w:rFonts w:asciiTheme="majorHAnsi" w:eastAsiaTheme="majorEastAsia" w:hAnsiTheme="majorHAnsi" w:cstheme="majorBidi"/>
+      <w:color w:val="0F4761" w:themeColor="accent1" w:themeShade="BF"/>
+      <w:sz w:val="26"/>
+      <w:szCs w:val="26"/>
+    </w:rPr>
+  </w:style>
   <w:style w:type="character" w:default="1" w:styleId="Fontepargpadro">
     <w:name w:val="Default Paragraph Font"/>
     <w:uiPriority w:val="1"/>
-    <w:semiHidden/>
     <w:unhideWhenUsed/>
   </w:style>
   <w:style w:type="table" w:default="1" w:styleId="Tabelanormal">
@@ -1921,6 +6564,20 @@
     <w:link w:val="Rodap"/>
     <w:uiPriority w:val="99"/>
     <w:rsid w:val="00B37EA3"/>
+  </w:style>
+  <w:style w:type="character" w:customStyle="1" w:styleId="Ttulo2Char">
+    <w:name w:val="Título 2 Char"/>
+    <w:basedOn w:val="Fontepargpadro"/>
+    <w:link w:val="Ttulo2"/>
+    <w:uiPriority w:val="9"/>
+    <w:semiHidden/>
+    <w:rsid w:val="00AE1044"/>
+    <w:rPr>
+      <w:rFonts w:asciiTheme="majorHAnsi" w:eastAsiaTheme="majorEastAsia" w:hAnsiTheme="majorHAnsi" w:cstheme="majorBidi"/>
+      <w:color w:val="0F4761" w:themeColor="accent1" w:themeShade="BF"/>
+      <w:sz w:val="26"/>
+      <w:szCs w:val="26"/>
+    </w:rPr>
   </w:style>
 </w:styles>
 </file>

</xml_diff>